<commit_message>
Added final steering, developer and discussion summaries
</commit_message>
<xml_diff>
--- a/doc/past_meetings/2025_dls/discussions/MXCuBE_Diamond2025_developers.docx
+++ b/doc/past_meetings/2025_dls/discussions/MXCuBE_Diamond2025_developers.docx
@@ -1,20 +1,22 @@
 
 <file path=word/document.xml><?xml version="1.0" encoding="utf-8"?>
-<w:document xmlns:o="urn:schemas-microsoft-com:office:office" xmlns:r="http://schemas.openxmlformats.org/officeDocument/2006/relationships" xmlns:v="urn:schemas-microsoft-com:vml" xmlns:w="http://schemas.openxmlformats.org/wordprocessingml/2006/main" xmlns:w10="urn:schemas-microsoft-com:office:word" xmlns:wp="http://schemas.openxmlformats.org/drawingml/2006/wordprocessingDrawing" xmlns:pic="http://schemas.openxmlformats.org/drawingml/2006/picture" xmlns:wps="http://schemas.microsoft.com/office/word/2010/wordprocessingShape" xmlns:wpg="http://schemas.microsoft.com/office/word/2010/wordprocessingGroup" xmlns:mc="http://schemas.openxmlformats.org/markup-compatibility/2006" xmlns:wp14="http://schemas.microsoft.com/office/word/2010/wordprocessingDrawing" xmlns:w14="http://schemas.microsoft.com/office/word/2010/wordml" xmlns:w15="http://schemas.microsoft.com/office/word/2012/wordml" mc:Ignorable="w14 wp14 w15">
+<w:document xmlns:wpc="http://schemas.microsoft.com/office/word/2010/wordprocessingCanvas" xmlns:cx="http://schemas.microsoft.com/office/drawing/2014/chartex" xmlns:cx1="http://schemas.microsoft.com/office/drawing/2015/9/8/chartex" xmlns:cx2="http://schemas.microsoft.com/office/drawing/2015/10/21/chartex" xmlns:cx3="http://schemas.microsoft.com/office/drawing/2016/5/9/chartex" xmlns:cx4="http://schemas.microsoft.com/office/drawing/2016/5/10/chartex" xmlns:cx5="http://schemas.microsoft.com/office/drawing/2016/5/11/chartex" xmlns:cx6="http://schemas.microsoft.com/office/drawing/2016/5/12/chartex" xmlns:cx7="http://schemas.microsoft.com/office/drawing/2016/5/13/chartex" xmlns:cx8="http://schemas.microsoft.com/office/drawing/2016/5/14/chartex" xmlns:mc="http://schemas.openxmlformats.org/markup-compatibility/2006" xmlns:aink="http://schemas.microsoft.com/office/drawing/2016/ink" xmlns:am3d="http://schemas.microsoft.com/office/drawing/2017/model3d" xmlns:o="urn:schemas-microsoft-com:office:office" xmlns:oel="http://schemas.microsoft.com/office/2019/extlst" xmlns:r="http://schemas.openxmlformats.org/officeDocument/2006/relationships" xmlns:m="http://schemas.openxmlformats.org/officeDocument/2006/math" xmlns:v="urn:schemas-microsoft-com:vml" xmlns:wp14="http://schemas.microsoft.com/office/word/2010/wordprocessingDrawing" xmlns:wp="http://schemas.openxmlformats.org/drawingml/2006/wordprocessingDrawing" xmlns:w10="urn:schemas-microsoft-com:office:word" xmlns:w="http://schemas.openxmlformats.org/wordprocessingml/2006/main" xmlns:w14="http://schemas.microsoft.com/office/word/2010/wordml" xmlns:w15="http://schemas.microsoft.com/office/word/2012/wordml" xmlns:w16cex="http://schemas.microsoft.com/office/word/2018/wordml/cex" xmlns:w16cid="http://schemas.microsoft.com/office/word/2016/wordml/cid" xmlns:w16="http://schemas.microsoft.com/office/word/2018/wordml" xmlns:w16du="http://schemas.microsoft.com/office/word/2023/wordml/word16du" xmlns:w16sdtdh="http://schemas.microsoft.com/office/word/2020/wordml/sdtdatahash" xmlns:w16sdtfl="http://schemas.microsoft.com/office/word/2024/wordml/sdtformatlock" xmlns:w16se="http://schemas.microsoft.com/office/word/2015/wordml/symex" xmlns:wpg="http://schemas.microsoft.com/office/word/2010/wordprocessingGroup" xmlns:wpi="http://schemas.microsoft.com/office/word/2010/wordprocessingInk" xmlns:wne="http://schemas.microsoft.com/office/word/2006/wordml" xmlns:wps="http://schemas.microsoft.com/office/word/2010/wordprocessingShape" mc:Ignorable="w14 w15 w16se w16cid w16 w16cex w16sdtdh w16sdtfl w16du wp14">
   <w:body>
     <w:p>
       <w:pPr>
         <w:pStyle w:val="Title"/>
         <w:numPr>
           <w:ilvl w:val="0"/>
-          <w:numId w:val="1"/>
+          <w:numId w:val="2"/>
         </w:numPr>
-        <w:spacing w:before="240" w:after="120"/>
-        <w:rPr/>
-      </w:pPr>
-      <w:r>
-        <w:rPr/>
-        <w:t>MXCuBE meeting, Diamond, November 19, 2025</w:t>
+      </w:pPr>
+      <w:proofErr w:type="spellStart"/>
+      <w:r>
+        <w:t>MXCuBE</w:t>
+      </w:r>
+      <w:proofErr w:type="spellEnd"/>
+      <w:r>
+        <w:t xml:space="preserve"> meeting, Diamond, November 19, 2025</w:t>
       </w:r>
     </w:p>
     <w:p>
@@ -22,12 +24,10 @@
         <w:pStyle w:val="Subtitle"/>
         <w:numPr>
           <w:ilvl w:val="0"/>
-          <w:numId w:val="1"/>
+          <w:numId w:val="2"/>
         </w:numPr>
-        <w:rPr/>
-      </w:pPr>
-      <w:r>
-        <w:rPr/>
+      </w:pPr>
+      <w:r>
         <w:t>Developers’ meeting minutes</w:t>
       </w:r>
     </w:p>
@@ -35,169 +35,287 @@
       <w:pPr>
         <w:pStyle w:val="Heading1"/>
         <w:jc w:val="center"/>
-        <w:rPr/>
-      </w:pPr>
-      <w:r>
-        <w:rPr/>
-      </w:r>
+      </w:pPr>
     </w:p>
     <w:p>
       <w:pPr>
         <w:pStyle w:val="Heading1"/>
-        <w:rPr/>
-      </w:pPr>
-      <w:r>
-        <w:rPr/>
+      </w:pPr>
+      <w:r>
         <w:t>Developers meeting</w:t>
       </w:r>
     </w:p>
     <w:p>
       <w:pPr>
         <w:pStyle w:val="Heading2"/>
-        <w:rPr/>
-      </w:pPr>
-      <w:r>
-        <w:rPr/>
+      </w:pPr>
+      <w:r>
         <w:t>Participants</w:t>
       </w:r>
     </w:p>
     <w:p>
-      <w:pPr>
-        <w:pStyle w:val="Normal"/>
-        <w:rPr/>
-      </w:pPr>
-      <w:r>
-        <w:rPr/>
+      <w:r>
         <w:t>Ezequiel Panepucci (MAX IV)</w:t>
       </w:r>
     </w:p>
     <w:p>
-      <w:pPr>
-        <w:pStyle w:val="Normal"/>
-        <w:rPr/>
-      </w:pPr>
-      <w:r>
-        <w:rPr/>
-        <w:t>Annie Heroux (ex Elettra)</w:t>
-      </w:r>
-    </w:p>
-    <w:p>
-      <w:pPr>
-        <w:pStyle w:val="Normal"/>
-        <w:rPr/>
-      </w:pPr>
-      <w:r>
-        <w:rPr/>
+      <w:r>
+        <w:t>Annie Heroux (ex</w:t>
+      </w:r>
+      <w:r>
+        <w:t>-</w:t>
+      </w:r>
+      <w:r>
+        <w:t>Elettra)</w:t>
+      </w:r>
+    </w:p>
+    <w:p>
+      <w:r>
         <w:t>Andrey Gruzinov (DESY)</w:t>
       </w:r>
     </w:p>
     <w:p>
-      <w:pPr>
-        <w:pStyle w:val="Normal"/>
-        <w:rPr/>
-      </w:pPr>
-      <w:r>
-        <w:rPr/>
+      <w:r>
         <w:t>Pawel Mocko (S2 Innovation)</w:t>
       </w:r>
     </w:p>
     <w:p>
-      <w:pPr>
-        <w:pStyle w:val="Normal"/>
-        <w:rPr/>
-      </w:pPr>
-      <w:r>
-        <w:rPr/>
+      <w:r>
         <w:t>Martin Savko (SOLEIL)</w:t>
       </w:r>
     </w:p>
     <w:p>
       <w:pPr>
-        <w:pStyle w:val="Normal"/>
-        <w:rPr/>
-      </w:pPr>
-      <w:r>
-        <w:rPr/>
-        <w:t>Yan Walesch, Antonia Beteva, Alex de Maria, Marcus Oscarsson (ESRF)</w:t>
-      </w:r>
-    </w:p>
-    <w:p>
-      <w:pPr>
-        <w:pStyle w:val="Normal"/>
-        <w:rPr/>
-      </w:pPr>
-      <w:r>
-        <w:rPr/>
-        <w:t>Clemens Vonrhein, Rasmus Fogh, Peter Keller (Global Phasing)</w:t>
-      </w:r>
-    </w:p>
-    <w:p>
-      <w:pPr>
-        <w:pStyle w:val="Normal"/>
-        <w:rPr/>
-      </w:pPr>
-      <w:r>
-        <w:rPr/>
+        <w:rPr>
+          <w:lang w:val="it-IT"/>
+        </w:rPr>
+      </w:pPr>
+      <w:proofErr w:type="spellStart"/>
+      <w:r>
+        <w:rPr>
+          <w:lang w:val="it-IT"/>
+        </w:rPr>
+        <w:t>Yan</w:t>
+      </w:r>
+      <w:proofErr w:type="spellEnd"/>
+      <w:r>
+        <w:rPr>
+          <w:lang w:val="it-IT"/>
+        </w:rPr>
+        <w:t xml:space="preserve"> </w:t>
+      </w:r>
+      <w:proofErr w:type="spellStart"/>
+      <w:r>
+        <w:rPr>
+          <w:lang w:val="it-IT"/>
+        </w:rPr>
+        <w:t>Walesch</w:t>
+      </w:r>
+      <w:proofErr w:type="spellEnd"/>
+      <w:r>
+        <w:rPr>
+          <w:lang w:val="it-IT"/>
+        </w:rPr>
+        <w:t xml:space="preserve">, Antonia </w:t>
+      </w:r>
+      <w:proofErr w:type="spellStart"/>
+      <w:r>
+        <w:rPr>
+          <w:lang w:val="it-IT"/>
+        </w:rPr>
+        <w:t>Beteva</w:t>
+      </w:r>
+      <w:proofErr w:type="spellEnd"/>
+      <w:r>
+        <w:rPr>
+          <w:lang w:val="it-IT"/>
+        </w:rPr>
+        <w:t xml:space="preserve">, Alex de Maria, Marcus </w:t>
+      </w:r>
+      <w:proofErr w:type="spellStart"/>
+      <w:r>
+        <w:rPr>
+          <w:lang w:val="it-IT"/>
+        </w:rPr>
+        <w:t>Oscarsson</w:t>
+      </w:r>
+      <w:proofErr w:type="spellEnd"/>
+      <w:r>
+        <w:rPr>
+          <w:lang w:val="it-IT"/>
+        </w:rPr>
+        <w:t xml:space="preserve"> (ESRF)</w:t>
+      </w:r>
+    </w:p>
+    <w:p>
+      <w:pPr>
+        <w:rPr>
+          <w:lang w:val="de-DE"/>
+        </w:rPr>
+      </w:pPr>
+      <w:r>
+        <w:rPr>
+          <w:lang w:val="de-DE"/>
+        </w:rPr>
+        <w:t xml:space="preserve">Clemens </w:t>
+      </w:r>
+      <w:proofErr w:type="spellStart"/>
+      <w:r>
+        <w:rPr>
+          <w:lang w:val="de-DE"/>
+        </w:rPr>
+        <w:t>Vonrhein</w:t>
+      </w:r>
+      <w:proofErr w:type="spellEnd"/>
+      <w:r>
+        <w:rPr>
+          <w:lang w:val="de-DE"/>
+        </w:rPr>
+        <w:t xml:space="preserve">, Rasmus Fogh, Peter Keller (Global </w:t>
+      </w:r>
+      <w:proofErr w:type="spellStart"/>
+      <w:r>
+        <w:rPr>
+          <w:lang w:val="de-DE"/>
+        </w:rPr>
+        <w:t>Phasing</w:t>
+      </w:r>
+      <w:proofErr w:type="spellEnd"/>
+      <w:r>
+        <w:rPr>
+          <w:lang w:val="de-DE"/>
+        </w:rPr>
+        <w:t>)</w:t>
+      </w:r>
+    </w:p>
+    <w:p>
+      <w:pPr>
+        <w:rPr>
+          <w:lang w:val="it-IT"/>
+        </w:rPr>
+      </w:pPr>
+      <w:r>
+        <w:rPr>
+          <w:lang w:val="de-DE"/>
+        </w:rPr>
+        <w:t xml:space="preserve"> </w:t>
+      </w:r>
+      <w:r>
+        <w:rPr>
+          <w:lang w:val="it-IT"/>
+        </w:rPr>
         <w:t>Alessandro Olivo (Elettra)</w:t>
       </w:r>
     </w:p>
     <w:p>
       <w:pPr>
-        <w:pStyle w:val="Normal"/>
-        <w:rPr/>
-      </w:pPr>
-      <w:r>
-        <w:rPr/>
-        <w:t>Michel Hellmig (HZB)</w:t>
-      </w:r>
-    </w:p>
-    <w:p>
-      <w:pPr>
-        <w:pStyle w:val="Normal"/>
-        <w:rPr/>
-      </w:pPr>
-      <w:r>
-        <w:rPr/>
+        <w:rPr>
+          <w:lang w:val="it-IT"/>
+        </w:rPr>
+      </w:pPr>
+      <w:r>
+        <w:rPr>
+          <w:lang w:val="it-IT"/>
+        </w:rPr>
+        <w:t xml:space="preserve">Michel </w:t>
+      </w:r>
+      <w:proofErr w:type="spellStart"/>
+      <w:r>
+        <w:rPr>
+          <w:lang w:val="it-IT"/>
+        </w:rPr>
+        <w:t>Hellmig</w:t>
+      </w:r>
+      <w:proofErr w:type="spellEnd"/>
+      <w:r>
+        <w:rPr>
+          <w:lang w:val="it-IT"/>
+        </w:rPr>
+        <w:t xml:space="preserve"> (HZB)</w:t>
+      </w:r>
+    </w:p>
+    <w:p>
+      <w:pPr>
+        <w:rPr>
+          <w:lang w:val="it-IT"/>
+        </w:rPr>
+      </w:pPr>
+      <w:r>
+        <w:rPr>
+          <w:lang w:val="it-IT"/>
+        </w:rPr>
         <w:t>Pedro Benetton (LNLS)</w:t>
       </w:r>
     </w:p>
     <w:p>
       <w:pPr>
-        <w:pStyle w:val="Normal"/>
-        <w:rPr/>
-      </w:pPr>
-      <w:r>
-        <w:rPr/>
-        <w:t>Michal Gucwa (Solaris)</w:t>
+        <w:rPr>
+          <w:lang w:val="it-IT"/>
+        </w:rPr>
+      </w:pPr>
+      <w:r>
+        <w:rPr>
+          <w:lang w:val="it-IT"/>
+        </w:rPr>
+        <w:t xml:space="preserve">Michal </w:t>
+      </w:r>
+      <w:proofErr w:type="spellStart"/>
+      <w:r>
+        <w:rPr>
+          <w:lang w:val="it-IT"/>
+        </w:rPr>
+        <w:t>Gucwa</w:t>
+      </w:r>
+      <w:proofErr w:type="spellEnd"/>
+      <w:r>
+        <w:rPr>
+          <w:lang w:val="it-IT"/>
+        </w:rPr>
+        <w:t xml:space="preserve"> (Solaris)</w:t>
       </w:r>
     </w:p>
     <w:p>
       <w:pPr>
         <w:pStyle w:val="Heading2"/>
-        <w:rPr/>
-      </w:pPr>
-      <w:r>
-        <w:rPr/>
-      </w:r>
+        <w:rPr>
+          <w:lang w:val="it-IT"/>
+        </w:rPr>
+      </w:pPr>
     </w:p>
     <w:p>
       <w:pPr>
         <w:pStyle w:val="Heading2"/>
-        <w:rPr/>
-      </w:pPr>
-      <w:r>
-        <w:rPr/>
+      </w:pPr>
+      <w:r>
         <w:t>Abstract Diffractometer</w:t>
       </w:r>
     </w:p>
     <w:p>
       <w:pPr>
         <w:pStyle w:val="BodyText"/>
-        <w:rPr/>
-      </w:pPr>
-      <w:r>
-        <w:rPr/>
-        <w:t xml:space="preserve">The new abstract diffractometer hardware object has been cleaned up and non-diffractometer functionality has been put in SampleView. The latter still needs refactoring. There is now a standard coordinate system for specifying axes, fixed motor names, fixed phase names, and a separation between existing and movable motors. </w:t>
+      </w:pPr>
+      <w:r>
+        <w:t>The new abstract diffractometer hardware object has been cleaned up</w:t>
+      </w:r>
+      <w:r>
+        <w:t>,</w:t>
+      </w:r>
+      <w:r>
+        <w:t xml:space="preserve"> and non-diffractometer functionality has been put in</w:t>
+      </w:r>
+      <w:r>
+        <w:t>to</w:t>
+      </w:r>
+      <w:r>
+        <w:t xml:space="preserve"> </w:t>
+      </w:r>
+      <w:proofErr w:type="spellStart"/>
+      <w:r>
+        <w:t>SampleView</w:t>
+      </w:r>
+      <w:proofErr w:type="spellEnd"/>
+      <w:r>
+        <w:t xml:space="preserve">. The latter still needs refactoring. There is now a standard coordinate system for specifying axes, fixed motor names, fixed phase names, and a separation between existing and movable motors. </w:t>
       </w:r>
       <w:r>
         <w:rPr>
@@ -207,48 +325,80 @@
         <w:t>ACTION PK</w:t>
       </w:r>
       <w:r>
-        <w:rPr/>
-        <w:t xml:space="preserve"> check if there is a standard coordinate definition (e.g. McSTAS) that we should consider adopting instead of the current  ESRF-standard one. The current PR should be checked quickly, as the plan is to finish testing and merge the AbstractDiffractometer ASAP; preferably Jan/Feb 2026</w:t>
+        <w:t xml:space="preserve"> check if there is a standard coordinate definition (e.g. </w:t>
+      </w:r>
+      <w:proofErr w:type="spellStart"/>
+      <w:r>
+        <w:t>McSTAS</w:t>
+      </w:r>
+      <w:proofErr w:type="spellEnd"/>
+      <w:r>
+        <w:t xml:space="preserve">) that we should consider adopting instead of the </w:t>
+      </w:r>
+      <w:r>
+        <w:t>current ESRF</w:t>
+      </w:r>
+      <w:r>
+        <w:t xml:space="preserve">-standard one.  The current PR should be checked quickly, as the plan is to finish testing and merge the </w:t>
+      </w:r>
+      <w:proofErr w:type="spellStart"/>
+      <w:r>
+        <w:t>AbstractDiffractometer</w:t>
+      </w:r>
+      <w:proofErr w:type="spellEnd"/>
+      <w:r>
+        <w:t xml:space="preserve"> ASAP; preferably Jan/Feb 2026</w:t>
       </w:r>
     </w:p>
     <w:p>
       <w:pPr>
         <w:pStyle w:val="Heading2"/>
-        <w:rPr/>
-      </w:pPr>
-      <w:r>
-        <w:rPr/>
+      </w:pPr>
+      <w:r>
         <w:t>Cybersecurity</w:t>
       </w:r>
     </w:p>
     <w:p>
-      <w:pPr>
-        <w:pStyle w:val="Normal"/>
-        <w:rPr/>
-      </w:pPr>
-      <w:r>
-        <w:rPr/>
-        <w:t>The ESRF report summary on their cybersecurity inspection has been received. There are no major weaknesses to fix. One outstanding change proposal is to replace the XMLRPC module (which is not used outside the ESRF). Replacement could be a different RPC system; GPhL would be interested in having a messaging system like e.g. ActiveMQ, since messaging is anyway needed for the GPhL workflow. A REST-based system was also proposed, which would fill the need but came with some technical problems.</w:t>
+      <w:r>
+        <w:t xml:space="preserve">The ESRF report summary on their cybersecurity inspection has been received. There are no major weaknesses to fix. One outstanding change proposal is to replace the XMLRPC module (which is not used outside the ESRF). Replacement could be a different RPC system; </w:t>
+      </w:r>
+      <w:proofErr w:type="spellStart"/>
+      <w:r>
+        <w:t>GPhL</w:t>
+      </w:r>
+      <w:proofErr w:type="spellEnd"/>
+      <w:r>
+        <w:t xml:space="preserve"> would be interested in having a messaging system like e.g. ActiveMQ, since messaging is anyway needed for the </w:t>
+      </w:r>
+      <w:proofErr w:type="spellStart"/>
+      <w:r>
+        <w:t>GPhL</w:t>
+      </w:r>
+      <w:proofErr w:type="spellEnd"/>
+      <w:r>
+        <w:t xml:space="preserve"> workflow. A REST-based system was also proposed, which would fill the need but came with some technical problems.</w:t>
       </w:r>
     </w:p>
     <w:p>
       <w:pPr>
         <w:pStyle w:val="Heading2"/>
-        <w:rPr/>
-      </w:pPr>
-      <w:r>
-        <w:rPr/>
+      </w:pPr>
+      <w:r>
+        <w:lastRenderedPageBreak/>
         <w:t>Configuration repository</w:t>
       </w:r>
     </w:p>
     <w:p>
-      <w:pPr>
-        <w:pStyle w:val="Normal"/>
-        <w:rPr/>
-      </w:pPr>
-      <w:r>
-        <w:rPr/>
-        <w:t>It was agreed to have a separate location for configuring tests – this is already in place in the code. It was also agreed to move to having the demo/mock configuration in the mxcube_configuration repository, the main argument being that this avoided having to maintain separate mock configuration repos for the web and qt branches.  It is necessary to make some changes in the Web version deployment to support this change (</w:t>
+      <w:r>
+        <w:t xml:space="preserve">It was agreed to have a separate location for configuring tests – this is already in place in the code. It was also agreed to move to having the demo/mock configuration in the </w:t>
+      </w:r>
+      <w:proofErr w:type="spellStart"/>
+      <w:r>
+        <w:t>mxcube_configuration</w:t>
+      </w:r>
+      <w:proofErr w:type="spellEnd"/>
+      <w:r>
+        <w:t xml:space="preserve"> repository, the main argument being that this avoided having to maintain separate mock configuration repos for the web and qt branches. It is necessary to make some changes in the Web version deployment to support this change (</w:t>
       </w:r>
       <w:r>
         <w:rPr>
@@ -258,73 +408,42 @@
         <w:t>ACTION: MO</w:t>
       </w:r>
       <w:r>
-        <w:rPr/>
         <w:t>), after which the move will be made.</w:t>
       </w:r>
     </w:p>
-    <w:p>
-      <w:pPr>
-        <w:pStyle w:val="Normal"/>
-        <w:rPr/>
-      </w:pPr>
-      <w:r>
-        <w:rPr/>
-      </w:r>
-    </w:p>
+    <w:p/>
     <w:p>
       <w:pPr>
         <w:pStyle w:val="Heading2"/>
-        <w:rPr/>
-      </w:pPr>
-      <w:r>
-        <w:rPr/>
-        <w:t>Pydantic models for configuration</w:t>
-      </w:r>
-    </w:p>
-    <w:p>
-      <w:pPr>
-        <w:pStyle w:val="Normal"/>
-        <w:rPr/>
-      </w:pPr>
-      <w:r>
-        <w:rPr/>
-        <w:t xml:space="preserve">It was agree that this should be introduced soon, after the change to the new configuration repo, and that it would be a </w:t>
-      </w:r>
-      <w:r>
-        <w:rPr/>
-        <w:t>potential</w:t>
-      </w:r>
-      <w:r>
-        <w:rPr/>
-        <w:t xml:space="preserve"> topic for the code camp.</w:t>
-      </w:r>
-    </w:p>
-    <w:p>
-      <w:pPr>
-        <w:pStyle w:val="Normal"/>
-        <w:rPr/>
-      </w:pPr>
-      <w:r>
-        <w:rPr/>
-      </w:r>
-    </w:p>
-    <w:p>
-      <w:pPr>
-        <w:pStyle w:val="Normal"/>
-        <w:rPr/>
-      </w:pPr>
-      <w:r>
-        <w:rPr/>
+      </w:pPr>
+      <w:proofErr w:type="spellStart"/>
+      <w:r>
+        <w:t>Pydantic</w:t>
+      </w:r>
+      <w:proofErr w:type="spellEnd"/>
+      <w:r>
+        <w:t xml:space="preserve"> models for configuration</w:t>
+      </w:r>
+    </w:p>
+    <w:p>
+      <w:r>
+        <w:t>It was agree</w:t>
+      </w:r>
+      <w:r>
+        <w:t>d</w:t>
+      </w:r>
+      <w:r>
+        <w:t xml:space="preserve"> that this should be introduced soon, after the change to the new configuration repo, and that it would be a good topic for the code camp.</w:t>
+      </w:r>
+    </w:p>
+    <w:p/>
+    <w:p>
+      <w:r>
         <w:t>Under this heading it was further agreed that it should be possible to specify that a given configuration parameter should be read from an environment variable (even though this could be seen as a duplicate configuration mechanism). The clinching argument was that certain configuration parameters having to do with access control could not, for security reasons, live in</w:t>
       </w:r>
     </w:p>
     <w:p>
-      <w:pPr>
-        <w:pStyle w:val="Normal"/>
-        <w:rPr/>
-      </w:pPr>
-      <w:r>
-        <w:rPr/>
+      <w:r>
         <w:t>a configuration file. PB would make a PR to start the discussion (</w:t>
       </w:r>
       <w:r>
@@ -335,7 +454,6 @@
         <w:t>ACTION PB</w:t>
       </w:r>
       <w:r>
-        <w:rPr/>
         <w:t>). One proposal was to have env-read parameters start with '</w:t>
       </w:r>
       <w:r>
@@ -346,81 +464,70 @@
         <w:t>.env://</w:t>
       </w:r>
       <w:r>
-        <w:rPr/>
         <w:t>')</w:t>
       </w:r>
     </w:p>
-    <w:p>
-      <w:pPr>
-        <w:pStyle w:val="Normal"/>
-        <w:rPr/>
-      </w:pPr>
-      <w:r>
-        <w:rPr/>
-      </w:r>
-    </w:p>
+    <w:p/>
     <w:p>
       <w:pPr>
         <w:pStyle w:val="Heading2"/>
-        <w:rPr/>
-      </w:pPr>
-      <w:r>
-        <w:rPr/>
+      </w:pPr>
+      <w:r>
         <w:t>Code camp</w:t>
       </w:r>
     </w:p>
     <w:p>
-      <w:pPr>
-        <w:pStyle w:val="Normal"/>
-        <w:rPr/>
-      </w:pPr>
-      <w:r>
-        <w:rPr/>
+      <w:r>
         <w:t xml:space="preserve">It was agreed to have a day and a half for the code camp, and to prefer it at the start of the meeting. </w:t>
       </w:r>
     </w:p>
     <w:p>
-      <w:pPr>
-        <w:pStyle w:val="Normal"/>
-        <w:rPr/>
-      </w:pPr>
-      <w:r>
-        <w:rPr/>
-        <w:t>Potential topics were Pydantic configuration and X-ray centring/processing. There was no enthusiasm for taking up linting as a topic.</w:t>
-      </w:r>
-    </w:p>
-    <w:p>
-      <w:pPr>
-        <w:pStyle w:val="Normal"/>
-        <w:rPr/>
-      </w:pPr>
-      <w:r>
-        <w:rPr/>
-      </w:r>
-    </w:p>
-    <w:p>
-      <w:pPr>
-        <w:pStyle w:val="Normal"/>
-        <w:rPr/>
-      </w:pPr>
-      <w:r>
-        <w:rPr/>
-        <w:t>An important topic proposed was to give an introduction for newcomers to MXCuBE, with detailed description and probably flow diagrams of key processes like acquis</w:t>
-      </w:r>
-      <w:r>
-        <w:rPr/>
+      <w:r>
+        <w:t xml:space="preserve">Potential topics were </w:t>
+      </w:r>
+      <w:proofErr w:type="spellStart"/>
+      <w:r>
+        <w:t>Pydantic</w:t>
+      </w:r>
+      <w:proofErr w:type="spellEnd"/>
+      <w:r>
+        <w:t xml:space="preserve"> configuration and X-ray centring/processing. There was no enthusiasm for taking up linting as a topic.</w:t>
+      </w:r>
+    </w:p>
+    <w:p/>
+    <w:p>
+      <w:r>
+        <w:t xml:space="preserve">An important topic proposed was to give an introduction for newcomers to </w:t>
+      </w:r>
+      <w:proofErr w:type="spellStart"/>
+      <w:r>
+        <w:t>MXCuBE</w:t>
+      </w:r>
+      <w:proofErr w:type="spellEnd"/>
+      <w:r>
+        <w:t>, with detailed description and probably flow diagrams of key processes like acquis</w:t>
+      </w:r>
+      <w:r>
         <w:t>i</w:t>
       </w:r>
       <w:r>
-        <w:rPr/>
         <w:t xml:space="preserve">tion, the workings </w:t>
       </w:r>
-      <w:r>
-        <w:rPr/>
-        <w:t>of the</w:t>
-      </w:r>
-      <w:r>
-        <w:rPr/>
+      <w:proofErr w:type="spellStart"/>
+      <w:r>
+        <w:t>f</w:t>
+      </w:r>
+      <w:r>
+        <w:t>o</w:t>
+      </w:r>
+      <w:proofErr w:type="spellEnd"/>
+      <w:r>
+        <w:t xml:space="preserve"> th</w:t>
+      </w:r>
+      <w:r>
+        <w:t>e</w:t>
+      </w:r>
+      <w:r>
         <w:t xml:space="preserve"> queue, centring, … This would be particularly useful for recent newcomers (e.g. at MAX IV), and new members from the US, Korea, and Poland. </w:t>
       </w:r>
       <w:r>
@@ -431,84 +538,89 @@
         <w:t>ACTION PB</w:t>
       </w:r>
       <w:r>
-        <w:rPr/>
         <w:t>, to make an issue showcasing the work he has already done on flow diagrams.</w:t>
       </w:r>
     </w:p>
     <w:p>
       <w:pPr>
         <w:pStyle w:val="BodyText"/>
-        <w:spacing w:lineRule="auto" w:line="276" w:before="0" w:after="140"/>
-        <w:rPr/>
-      </w:pPr>
-      <w:r>
-        <w:rPr/>
-      </w:r>
+      </w:pPr>
     </w:p>
     <w:sectPr>
-      <w:headerReference w:type="even" r:id="rId2"/>
-      <w:headerReference w:type="default" r:id="rId3"/>
-      <w:headerReference w:type="first" r:id="rId4"/>
-      <w:footerReference w:type="even" r:id="rId5"/>
-      <w:footerReference w:type="default" r:id="rId6"/>
-      <w:footerReference w:type="first" r:id="rId7"/>
-      <w:type w:val="nextPage"/>
+      <w:headerReference w:type="even" r:id="rId7"/>
+      <w:headerReference w:type="default" r:id="rId8"/>
+      <w:footerReference w:type="even" r:id="rId9"/>
+      <w:footerReference w:type="default" r:id="rId10"/>
+      <w:headerReference w:type="first" r:id="rId11"/>
+      <w:footerReference w:type="first" r:id="rId12"/>
       <w:pgSz w:w="11906" w:h="16838"/>
-      <w:pgMar w:left="1134" w:right="1134" w:gutter="0" w:header="1134" w:top="1693" w:footer="1134" w:bottom="1693"/>
-      <w:pgNumType w:start="1" w:fmt="decimal"/>
-      <w:formProt w:val="false"/>
-      <w:textDirection w:val="lrTb"/>
-      <w:docGrid w:type="default" w:linePitch="600" w:charSpace="32768"/>
+      <w:pgMar w:top="1693" w:right="1134" w:bottom="1693" w:left="1134" w:header="1134" w:footer="1134" w:gutter="0"/>
+      <w:pgNumType w:start="1"/>
+      <w:cols w:space="720"/>
+      <w:formProt w:val="0"/>
+      <w:docGrid w:linePitch="600" w:charSpace="32768"/>
     </w:sectPr>
   </w:body>
 </w:document>
 </file>
 
+<file path=word/endnotes.xml><?xml version="1.0" encoding="utf-8"?>
+<w:endnotes xmlns:wpc="http://schemas.microsoft.com/office/word/2010/wordprocessingCanvas" xmlns:cx="http://schemas.microsoft.com/office/drawing/2014/chartex" xmlns:cx1="http://schemas.microsoft.com/office/drawing/2015/9/8/chartex" xmlns:cx2="http://schemas.microsoft.com/office/drawing/2015/10/21/chartex" xmlns:cx3="http://schemas.microsoft.com/office/drawing/2016/5/9/chartex" xmlns:cx4="http://schemas.microsoft.com/office/drawing/2016/5/10/chartex" xmlns:cx5="http://schemas.microsoft.com/office/drawing/2016/5/11/chartex" xmlns:cx6="http://schemas.microsoft.com/office/drawing/2016/5/12/chartex" xmlns:cx7="http://schemas.microsoft.com/office/drawing/2016/5/13/chartex" xmlns:cx8="http://schemas.microsoft.com/office/drawing/2016/5/14/chartex" xmlns:mc="http://schemas.openxmlformats.org/markup-compatibility/2006" xmlns:aink="http://schemas.microsoft.com/office/drawing/2016/ink" xmlns:am3d="http://schemas.microsoft.com/office/drawing/2017/model3d" xmlns:o="urn:schemas-microsoft-com:office:office" xmlns:oel="http://schemas.microsoft.com/office/2019/extlst" xmlns:r="http://schemas.openxmlformats.org/officeDocument/2006/relationships" xmlns:m="http://schemas.openxmlformats.org/officeDocument/2006/math" xmlns:v="urn:schemas-microsoft-com:vml" xmlns:wp14="http://schemas.microsoft.com/office/word/2010/wordprocessingDrawing" xmlns:wp="http://schemas.openxmlformats.org/drawingml/2006/wordprocessingDrawing" xmlns:w10="urn:schemas-microsoft-com:office:word" xmlns:w="http://schemas.openxmlformats.org/wordprocessingml/2006/main" xmlns:w14="http://schemas.microsoft.com/office/word/2010/wordml" xmlns:w15="http://schemas.microsoft.com/office/word/2012/wordml" xmlns:w16cex="http://schemas.microsoft.com/office/word/2018/wordml/cex" xmlns:w16cid="http://schemas.microsoft.com/office/word/2016/wordml/cid" xmlns:w16="http://schemas.microsoft.com/office/word/2018/wordml" xmlns:w16du="http://schemas.microsoft.com/office/word/2023/wordml/word16du" xmlns:w16sdtdh="http://schemas.microsoft.com/office/word/2020/wordml/sdtdatahash" xmlns:w16sdtfl="http://schemas.microsoft.com/office/word/2024/wordml/sdtformatlock" xmlns:w16se="http://schemas.microsoft.com/office/word/2015/wordml/symex" xmlns:wpg="http://schemas.microsoft.com/office/word/2010/wordprocessingGroup" xmlns:wpi="http://schemas.microsoft.com/office/word/2010/wordprocessingInk" xmlns:wne="http://schemas.microsoft.com/office/word/2006/wordml" xmlns:wps="http://schemas.microsoft.com/office/word/2010/wordprocessingShape" mc:Ignorable="w14 w15 w16se w16cid w16 w16cex w16sdtdh w16sdtfl w16du wp14">
+  <w:endnote w:type="separator" w:id="-1">
+    <w:p>
+      <w:r>
+        <w:separator/>
+      </w:r>
+    </w:p>
+  </w:endnote>
+  <w:endnote w:type="continuationSeparator" w:id="0">
+    <w:p>
+      <w:r>
+        <w:continuationSeparator/>
+      </w:r>
+    </w:p>
+  </w:endnote>
+</w:endnotes>
+</file>
+
 <file path=word/footer1.xml><?xml version="1.0" encoding="utf-8"?>
-<w:ftr xmlns:o="urn:schemas-microsoft-com:office:office" xmlns:r="http://schemas.openxmlformats.org/officeDocument/2006/relationships" xmlns:v="urn:schemas-microsoft-com:vml" xmlns:w="http://schemas.openxmlformats.org/wordprocessingml/2006/main" xmlns:w10="urn:schemas-microsoft-com:office:word" xmlns:wp="http://schemas.openxmlformats.org/drawingml/2006/wordprocessingDrawing" xmlns:pic="http://schemas.openxmlformats.org/drawingml/2006/picture" xmlns:wps="http://schemas.microsoft.com/office/word/2010/wordprocessingShape" xmlns:wpg="http://schemas.microsoft.com/office/word/2010/wordprocessingGroup" xmlns:mc="http://schemas.openxmlformats.org/markup-compatibility/2006" xmlns:wp14="http://schemas.microsoft.com/office/word/2010/wordprocessingDrawing" xmlns:w14="http://schemas.microsoft.com/office/word/2010/wordml" xmlns:w15="http://schemas.microsoft.com/office/word/2012/wordml" mc:Ignorable="w14 wp14 w15">
+<w:ftr xmlns:wpc="http://schemas.microsoft.com/office/word/2010/wordprocessingCanvas" xmlns:cx="http://schemas.microsoft.com/office/drawing/2014/chartex" xmlns:cx1="http://schemas.microsoft.com/office/drawing/2015/9/8/chartex" xmlns:cx2="http://schemas.microsoft.com/office/drawing/2015/10/21/chartex" xmlns:cx3="http://schemas.microsoft.com/office/drawing/2016/5/9/chartex" xmlns:cx4="http://schemas.microsoft.com/office/drawing/2016/5/10/chartex" xmlns:cx5="http://schemas.microsoft.com/office/drawing/2016/5/11/chartex" xmlns:cx6="http://schemas.microsoft.com/office/drawing/2016/5/12/chartex" xmlns:cx7="http://schemas.microsoft.com/office/drawing/2016/5/13/chartex" xmlns:cx8="http://schemas.microsoft.com/office/drawing/2016/5/14/chartex" xmlns:mc="http://schemas.openxmlformats.org/markup-compatibility/2006" xmlns:aink="http://schemas.microsoft.com/office/drawing/2016/ink" xmlns:am3d="http://schemas.microsoft.com/office/drawing/2017/model3d" xmlns:o="urn:schemas-microsoft-com:office:office" xmlns:oel="http://schemas.microsoft.com/office/2019/extlst" xmlns:r="http://schemas.openxmlformats.org/officeDocument/2006/relationships" xmlns:m="http://schemas.openxmlformats.org/officeDocument/2006/math" xmlns:v="urn:schemas-microsoft-com:vml" xmlns:wp14="http://schemas.microsoft.com/office/word/2010/wordprocessingDrawing" xmlns:wp="http://schemas.openxmlformats.org/drawingml/2006/wordprocessingDrawing" xmlns:w10="urn:schemas-microsoft-com:office:word" xmlns:w="http://schemas.openxmlformats.org/wordprocessingml/2006/main" xmlns:w14="http://schemas.microsoft.com/office/word/2010/wordml" xmlns:w15="http://schemas.microsoft.com/office/word/2012/wordml" xmlns:w16cex="http://schemas.microsoft.com/office/word/2018/wordml/cex" xmlns:w16cid="http://schemas.microsoft.com/office/word/2016/wordml/cid" xmlns:w16="http://schemas.microsoft.com/office/word/2018/wordml" xmlns:w16du="http://schemas.microsoft.com/office/word/2023/wordml/word16du" xmlns:w16sdtdh="http://schemas.microsoft.com/office/word/2020/wordml/sdtdatahash" xmlns:w16sdtfl="http://schemas.microsoft.com/office/word/2024/wordml/sdtformatlock" xmlns:w16se="http://schemas.microsoft.com/office/word/2015/wordml/symex" xmlns:wpg="http://schemas.microsoft.com/office/word/2010/wordprocessingGroup" xmlns:wpi="http://schemas.microsoft.com/office/word/2010/wordprocessingInk" xmlns:wne="http://schemas.microsoft.com/office/word/2006/wordml" xmlns:wps="http://schemas.microsoft.com/office/word/2010/wordprocessingShape" mc:Ignorable="w14 w15 w16se w16cid w16 w16cex w16sdtdh w16sdtfl w16du wp14">
   <w:p>
     <w:pPr>
       <w:pStyle w:val="Footer"/>
-      <w:rPr/>
     </w:pPr>
-    <w:r>
-      <w:rPr/>
-    </w:r>
   </w:p>
 </w:ftr>
 </file>
 
 <file path=word/footer2.xml><?xml version="1.0" encoding="utf-8"?>
-<w:ftr xmlns:o="urn:schemas-microsoft-com:office:office" xmlns:r="http://schemas.openxmlformats.org/officeDocument/2006/relationships" xmlns:v="urn:schemas-microsoft-com:vml" xmlns:w="http://schemas.openxmlformats.org/wordprocessingml/2006/main" xmlns:w10="urn:schemas-microsoft-com:office:word" xmlns:wp="http://schemas.openxmlformats.org/drawingml/2006/wordprocessingDrawing" xmlns:pic="http://schemas.openxmlformats.org/drawingml/2006/picture" xmlns:wps="http://schemas.microsoft.com/office/word/2010/wordprocessingShape" xmlns:wpg="http://schemas.microsoft.com/office/word/2010/wordprocessingGroup" xmlns:mc="http://schemas.openxmlformats.org/markup-compatibility/2006" xmlns:wp14="http://schemas.microsoft.com/office/word/2010/wordprocessingDrawing" xmlns:w14="http://schemas.microsoft.com/office/word/2010/wordml" xmlns:w15="http://schemas.microsoft.com/office/word/2012/wordml" mc:Ignorable="w14 wp14 w15">
+<w:ftr xmlns:wpc="http://schemas.microsoft.com/office/word/2010/wordprocessingCanvas" xmlns:cx="http://schemas.microsoft.com/office/drawing/2014/chartex" xmlns:cx1="http://schemas.microsoft.com/office/drawing/2015/9/8/chartex" xmlns:cx2="http://schemas.microsoft.com/office/drawing/2015/10/21/chartex" xmlns:cx3="http://schemas.microsoft.com/office/drawing/2016/5/9/chartex" xmlns:cx4="http://schemas.microsoft.com/office/drawing/2016/5/10/chartex" xmlns:cx5="http://schemas.microsoft.com/office/drawing/2016/5/11/chartex" xmlns:cx6="http://schemas.microsoft.com/office/drawing/2016/5/12/chartex" xmlns:cx7="http://schemas.microsoft.com/office/drawing/2016/5/13/chartex" xmlns:cx8="http://schemas.microsoft.com/office/drawing/2016/5/14/chartex" xmlns:mc="http://schemas.openxmlformats.org/markup-compatibility/2006" xmlns:aink="http://schemas.microsoft.com/office/drawing/2016/ink" xmlns:am3d="http://schemas.microsoft.com/office/drawing/2017/model3d" xmlns:o="urn:schemas-microsoft-com:office:office" xmlns:oel="http://schemas.microsoft.com/office/2019/extlst" xmlns:r="http://schemas.openxmlformats.org/officeDocument/2006/relationships" xmlns:m="http://schemas.openxmlformats.org/officeDocument/2006/math" xmlns:v="urn:schemas-microsoft-com:vml" xmlns:wp14="http://schemas.microsoft.com/office/word/2010/wordprocessingDrawing" xmlns:wp="http://schemas.openxmlformats.org/drawingml/2006/wordprocessingDrawing" xmlns:w10="urn:schemas-microsoft-com:office:word" xmlns:w="http://schemas.openxmlformats.org/wordprocessingml/2006/main" xmlns:w14="http://schemas.microsoft.com/office/word/2010/wordml" xmlns:w15="http://schemas.microsoft.com/office/word/2012/wordml" xmlns:w16cex="http://schemas.microsoft.com/office/word/2018/wordml/cex" xmlns:w16cid="http://schemas.microsoft.com/office/word/2016/wordml/cid" xmlns:w16="http://schemas.microsoft.com/office/word/2018/wordml" xmlns:w16du="http://schemas.microsoft.com/office/word/2023/wordml/word16du" xmlns:w16sdtdh="http://schemas.microsoft.com/office/word/2020/wordml/sdtdatahash" xmlns:w16sdtfl="http://schemas.microsoft.com/office/word/2024/wordml/sdtformatlock" xmlns:w16se="http://schemas.microsoft.com/office/word/2015/wordml/symex" xmlns:wpg="http://schemas.microsoft.com/office/word/2010/wordprocessingGroup" xmlns:wpi="http://schemas.microsoft.com/office/word/2010/wordprocessingInk" xmlns:wne="http://schemas.microsoft.com/office/word/2006/wordml" xmlns:wps="http://schemas.microsoft.com/office/word/2010/wordprocessingShape" mc:Ignorable="w14 w15 w16se w16cid w16 w16cex w16sdtdh w16sdtfl w16du wp14">
   <w:p>
     <w:pPr>
       <w:pStyle w:val="Footer"/>
-      <w:rPr/>
     </w:pPr>
     <w:r>
-      <w:rPr/>
       <w:t>Rasmus Fogh – Global Phasing</w:t>
+    </w:r>
+    <w:r>
       <w:tab/>
+    </w:r>
+    <w:r>
       <w:tab/>
     </w:r>
     <w:r>
-      <w:rPr/>
-      <w:fldChar w:fldCharType="begin" w:fldLock="true"/>
-    </w:r>
-    <w:r>
-      <w:rPr/>
-      <w:instrText xml:space="preserve"> DATE \@"dd\/MM\/yy" </w:instrText>
-    </w:r>
-    <w:r>
-      <w:rPr/>
+      <w:fldChar w:fldCharType="begin" w:fldLock="1"/>
+    </w:r>
+    <w:r>
+      <w:instrText xml:space="preserve"> DATE \@"dd/MM/yy" </w:instrText>
+    </w:r>
+    <w:r>
       <w:fldChar w:fldCharType="separate"/>
     </w:r>
     <w:r>
-      <w:rPr/>
       <w:t>21/11/25</w:t>
     </w:r>
     <w:r>
-      <w:rPr/>
       <w:fldChar w:fldCharType="end"/>
     </w:r>
   </w:p>
@@ -516,86 +628,93 @@
 </file>
 
 <file path=word/footer3.xml><?xml version="1.0" encoding="utf-8"?>
-<w:ftr xmlns:o="urn:schemas-microsoft-com:office:office" xmlns:r="http://schemas.openxmlformats.org/officeDocument/2006/relationships" xmlns:v="urn:schemas-microsoft-com:vml" xmlns:w="http://schemas.openxmlformats.org/wordprocessingml/2006/main" xmlns:w10="urn:schemas-microsoft-com:office:word" xmlns:wp="http://schemas.openxmlformats.org/drawingml/2006/wordprocessingDrawing" xmlns:pic="http://schemas.openxmlformats.org/drawingml/2006/picture" xmlns:wps="http://schemas.microsoft.com/office/word/2010/wordprocessingShape" xmlns:wpg="http://schemas.microsoft.com/office/word/2010/wordprocessingGroup" xmlns:mc="http://schemas.openxmlformats.org/markup-compatibility/2006" xmlns:wp14="http://schemas.microsoft.com/office/word/2010/wordprocessingDrawing" xmlns:w14="http://schemas.microsoft.com/office/word/2010/wordml" xmlns:w15="http://schemas.microsoft.com/office/word/2012/wordml" mc:Ignorable="w14 wp14 w15">
+<w:ftr xmlns:wpc="http://schemas.microsoft.com/office/word/2010/wordprocessingCanvas" xmlns:cx="http://schemas.microsoft.com/office/drawing/2014/chartex" xmlns:cx1="http://schemas.microsoft.com/office/drawing/2015/9/8/chartex" xmlns:cx2="http://schemas.microsoft.com/office/drawing/2015/10/21/chartex" xmlns:cx3="http://schemas.microsoft.com/office/drawing/2016/5/9/chartex" xmlns:cx4="http://schemas.microsoft.com/office/drawing/2016/5/10/chartex" xmlns:cx5="http://schemas.microsoft.com/office/drawing/2016/5/11/chartex" xmlns:cx6="http://schemas.microsoft.com/office/drawing/2016/5/12/chartex" xmlns:cx7="http://schemas.microsoft.com/office/drawing/2016/5/13/chartex" xmlns:cx8="http://schemas.microsoft.com/office/drawing/2016/5/14/chartex" xmlns:mc="http://schemas.openxmlformats.org/markup-compatibility/2006" xmlns:aink="http://schemas.microsoft.com/office/drawing/2016/ink" xmlns:am3d="http://schemas.microsoft.com/office/drawing/2017/model3d" xmlns:o="urn:schemas-microsoft-com:office:office" xmlns:oel="http://schemas.microsoft.com/office/2019/extlst" xmlns:r="http://schemas.openxmlformats.org/officeDocument/2006/relationships" xmlns:m="http://schemas.openxmlformats.org/officeDocument/2006/math" xmlns:v="urn:schemas-microsoft-com:vml" xmlns:wp14="http://schemas.microsoft.com/office/word/2010/wordprocessingDrawing" xmlns:wp="http://schemas.openxmlformats.org/drawingml/2006/wordprocessingDrawing" xmlns:w10="urn:schemas-microsoft-com:office:word" xmlns:w="http://schemas.openxmlformats.org/wordprocessingml/2006/main" xmlns:w14="http://schemas.microsoft.com/office/word/2010/wordml" xmlns:w15="http://schemas.microsoft.com/office/word/2012/wordml" xmlns:w16cex="http://schemas.microsoft.com/office/word/2018/wordml/cex" xmlns:w16cid="http://schemas.microsoft.com/office/word/2016/wordml/cid" xmlns:w16="http://schemas.microsoft.com/office/word/2018/wordml" xmlns:w16du="http://schemas.microsoft.com/office/word/2023/wordml/word16du" xmlns:w16sdtdh="http://schemas.microsoft.com/office/word/2020/wordml/sdtdatahash" xmlns:w16sdtfl="http://schemas.microsoft.com/office/word/2024/wordml/sdtformatlock" xmlns:w16se="http://schemas.microsoft.com/office/word/2015/wordml/symex" xmlns:wpg="http://schemas.microsoft.com/office/word/2010/wordprocessingGroup" xmlns:wpi="http://schemas.microsoft.com/office/word/2010/wordprocessingInk" xmlns:wne="http://schemas.microsoft.com/office/word/2006/wordml" xmlns:wps="http://schemas.microsoft.com/office/word/2010/wordprocessingShape" mc:Ignorable="w14 w15 w16se w16cid w16 w16cex w16sdtdh w16sdtfl w16du wp14">
   <w:p>
     <w:pPr>
       <w:pStyle w:val="Footer"/>
-      <w:rPr/>
     </w:pPr>
     <w:r>
-      <w:rPr/>
       <w:t>Rasmus Fogh – Global Phasing</w:t>
+    </w:r>
+    <w:r>
       <w:tab/>
+    </w:r>
+    <w:r>
       <w:tab/>
     </w:r>
     <w:r>
-      <w:rPr/>
-      <w:fldChar w:fldCharType="begin" w:fldLock="true"/>
-    </w:r>
-    <w:r>
-      <w:rPr/>
-      <w:instrText xml:space="preserve"> DATE \@"dd\/MM\/yy" </w:instrText>
-    </w:r>
-    <w:r>
-      <w:rPr/>
+      <w:fldChar w:fldCharType="begin" w:fldLock="1"/>
+    </w:r>
+    <w:r>
+      <w:instrText xml:space="preserve"> DATE \@"dd/MM/yy" </w:instrText>
+    </w:r>
+    <w:r>
       <w:fldChar w:fldCharType="separate"/>
     </w:r>
     <w:r>
-      <w:rPr/>
       <w:t>21/11/25</w:t>
     </w:r>
     <w:r>
-      <w:rPr/>
       <w:fldChar w:fldCharType="end"/>
     </w:r>
   </w:p>
 </w:ftr>
 </file>
 
+<file path=word/footnotes.xml><?xml version="1.0" encoding="utf-8"?>
+<w:footnotes xmlns:wpc="http://schemas.microsoft.com/office/word/2010/wordprocessingCanvas" xmlns:cx="http://schemas.microsoft.com/office/drawing/2014/chartex" xmlns:cx1="http://schemas.microsoft.com/office/drawing/2015/9/8/chartex" xmlns:cx2="http://schemas.microsoft.com/office/drawing/2015/10/21/chartex" xmlns:cx3="http://schemas.microsoft.com/office/drawing/2016/5/9/chartex" xmlns:cx4="http://schemas.microsoft.com/office/drawing/2016/5/10/chartex" xmlns:cx5="http://schemas.microsoft.com/office/drawing/2016/5/11/chartex" xmlns:cx6="http://schemas.microsoft.com/office/drawing/2016/5/12/chartex" xmlns:cx7="http://schemas.microsoft.com/office/drawing/2016/5/13/chartex" xmlns:cx8="http://schemas.microsoft.com/office/drawing/2016/5/14/chartex" xmlns:mc="http://schemas.openxmlformats.org/markup-compatibility/2006" xmlns:aink="http://schemas.microsoft.com/office/drawing/2016/ink" xmlns:am3d="http://schemas.microsoft.com/office/drawing/2017/model3d" xmlns:o="urn:schemas-microsoft-com:office:office" xmlns:oel="http://schemas.microsoft.com/office/2019/extlst" xmlns:r="http://schemas.openxmlformats.org/officeDocument/2006/relationships" xmlns:m="http://schemas.openxmlformats.org/officeDocument/2006/math" xmlns:v="urn:schemas-microsoft-com:vml" xmlns:wp14="http://schemas.microsoft.com/office/word/2010/wordprocessingDrawing" xmlns:wp="http://schemas.openxmlformats.org/drawingml/2006/wordprocessingDrawing" xmlns:w10="urn:schemas-microsoft-com:office:word" xmlns:w="http://schemas.openxmlformats.org/wordprocessingml/2006/main" xmlns:w14="http://schemas.microsoft.com/office/word/2010/wordml" xmlns:w15="http://schemas.microsoft.com/office/word/2012/wordml" xmlns:w16cex="http://schemas.microsoft.com/office/word/2018/wordml/cex" xmlns:w16cid="http://schemas.microsoft.com/office/word/2016/wordml/cid" xmlns:w16="http://schemas.microsoft.com/office/word/2018/wordml" xmlns:w16du="http://schemas.microsoft.com/office/word/2023/wordml/word16du" xmlns:w16sdtdh="http://schemas.microsoft.com/office/word/2020/wordml/sdtdatahash" xmlns:w16sdtfl="http://schemas.microsoft.com/office/word/2024/wordml/sdtformatlock" xmlns:w16se="http://schemas.microsoft.com/office/word/2015/wordml/symex" xmlns:wpg="http://schemas.microsoft.com/office/word/2010/wordprocessingGroup" xmlns:wpi="http://schemas.microsoft.com/office/word/2010/wordprocessingInk" xmlns:wne="http://schemas.microsoft.com/office/word/2006/wordml" xmlns:wps="http://schemas.microsoft.com/office/word/2010/wordprocessingShape" mc:Ignorable="w14 w15 w16se w16cid w16 w16cex w16sdtdh w16sdtfl w16du wp14">
+  <w:footnote w:type="separator" w:id="-1">
+    <w:p>
+      <w:r>
+        <w:separator/>
+      </w:r>
+    </w:p>
+  </w:footnote>
+  <w:footnote w:type="continuationSeparator" w:id="0">
+    <w:p>
+      <w:r>
+        <w:continuationSeparator/>
+      </w:r>
+    </w:p>
+  </w:footnote>
+</w:footnotes>
+</file>
+
 <file path=word/header1.xml><?xml version="1.0" encoding="utf-8"?>
-<w:hdr xmlns:o="urn:schemas-microsoft-com:office:office" xmlns:r="http://schemas.openxmlformats.org/officeDocument/2006/relationships" xmlns:v="urn:schemas-microsoft-com:vml" xmlns:w="http://schemas.openxmlformats.org/wordprocessingml/2006/main" xmlns:w10="urn:schemas-microsoft-com:office:word" xmlns:wp="http://schemas.openxmlformats.org/drawingml/2006/wordprocessingDrawing" xmlns:pic="http://schemas.openxmlformats.org/drawingml/2006/picture" xmlns:wps="http://schemas.microsoft.com/office/word/2010/wordprocessingShape" xmlns:wpg="http://schemas.microsoft.com/office/word/2010/wordprocessingGroup" xmlns:mc="http://schemas.openxmlformats.org/markup-compatibility/2006" xmlns:wp14="http://schemas.microsoft.com/office/word/2010/wordprocessingDrawing" xmlns:w14="http://schemas.microsoft.com/office/word/2010/wordml" xmlns:w15="http://schemas.microsoft.com/office/word/2012/wordml" mc:Ignorable="w14 wp14 w15">
+<w:hdr xmlns:wpc="http://schemas.microsoft.com/office/word/2010/wordprocessingCanvas" xmlns:cx="http://schemas.microsoft.com/office/drawing/2014/chartex" xmlns:cx1="http://schemas.microsoft.com/office/drawing/2015/9/8/chartex" xmlns:cx2="http://schemas.microsoft.com/office/drawing/2015/10/21/chartex" xmlns:cx3="http://schemas.microsoft.com/office/drawing/2016/5/9/chartex" xmlns:cx4="http://schemas.microsoft.com/office/drawing/2016/5/10/chartex" xmlns:cx5="http://schemas.microsoft.com/office/drawing/2016/5/11/chartex" xmlns:cx6="http://schemas.microsoft.com/office/drawing/2016/5/12/chartex" xmlns:cx7="http://schemas.microsoft.com/office/drawing/2016/5/13/chartex" xmlns:cx8="http://schemas.microsoft.com/office/drawing/2016/5/14/chartex" xmlns:mc="http://schemas.openxmlformats.org/markup-compatibility/2006" xmlns:aink="http://schemas.microsoft.com/office/drawing/2016/ink" xmlns:am3d="http://schemas.microsoft.com/office/drawing/2017/model3d" xmlns:o="urn:schemas-microsoft-com:office:office" xmlns:oel="http://schemas.microsoft.com/office/2019/extlst" xmlns:r="http://schemas.openxmlformats.org/officeDocument/2006/relationships" xmlns:m="http://schemas.openxmlformats.org/officeDocument/2006/math" xmlns:v="urn:schemas-microsoft-com:vml" xmlns:wp14="http://schemas.microsoft.com/office/word/2010/wordprocessingDrawing" xmlns:wp="http://schemas.openxmlformats.org/drawingml/2006/wordprocessingDrawing" xmlns:w10="urn:schemas-microsoft-com:office:word" xmlns:w="http://schemas.openxmlformats.org/wordprocessingml/2006/main" xmlns:w14="http://schemas.microsoft.com/office/word/2010/wordml" xmlns:w15="http://schemas.microsoft.com/office/word/2012/wordml" xmlns:w16cex="http://schemas.microsoft.com/office/word/2018/wordml/cex" xmlns:w16cid="http://schemas.microsoft.com/office/word/2016/wordml/cid" xmlns:w16="http://schemas.microsoft.com/office/word/2018/wordml" xmlns:w16du="http://schemas.microsoft.com/office/word/2023/wordml/word16du" xmlns:w16sdtdh="http://schemas.microsoft.com/office/word/2020/wordml/sdtdatahash" xmlns:w16sdtfl="http://schemas.microsoft.com/office/word/2024/wordml/sdtformatlock" xmlns:w16se="http://schemas.microsoft.com/office/word/2015/wordml/symex" xmlns:wpg="http://schemas.microsoft.com/office/word/2010/wordprocessingGroup" xmlns:wpi="http://schemas.microsoft.com/office/word/2010/wordprocessingInk" xmlns:wne="http://schemas.microsoft.com/office/word/2006/wordml" xmlns:wps="http://schemas.microsoft.com/office/word/2010/wordprocessingShape" mc:Ignorable="w14 w15 w16se w16cid w16 w16cex w16sdtdh w16sdtfl w16du wp14">
   <w:p>
     <w:pPr>
       <w:pStyle w:val="Header"/>
-      <w:rPr/>
     </w:pPr>
-    <w:r>
-      <w:rPr/>
-    </w:r>
   </w:p>
 </w:hdr>
 </file>
 
 <file path=word/header2.xml><?xml version="1.0" encoding="utf-8"?>
-<w:hdr xmlns:o="urn:schemas-microsoft-com:office:office" xmlns:r="http://schemas.openxmlformats.org/officeDocument/2006/relationships" xmlns:v="urn:schemas-microsoft-com:vml" xmlns:w="http://schemas.openxmlformats.org/wordprocessingml/2006/main" xmlns:w10="urn:schemas-microsoft-com:office:word" xmlns:wp="http://schemas.openxmlformats.org/drawingml/2006/wordprocessingDrawing" xmlns:pic="http://schemas.openxmlformats.org/drawingml/2006/picture" xmlns:wps="http://schemas.microsoft.com/office/word/2010/wordprocessingShape" xmlns:wpg="http://schemas.microsoft.com/office/word/2010/wordprocessingGroup" xmlns:mc="http://schemas.openxmlformats.org/markup-compatibility/2006" xmlns:wp14="http://schemas.microsoft.com/office/word/2010/wordprocessingDrawing" xmlns:w14="http://schemas.microsoft.com/office/word/2010/wordml" xmlns:w15="http://schemas.microsoft.com/office/word/2012/wordml" mc:Ignorable="w14 wp14 w15">
+<w:hdr xmlns:wpc="http://schemas.microsoft.com/office/word/2010/wordprocessingCanvas" xmlns:cx="http://schemas.microsoft.com/office/drawing/2014/chartex" xmlns:cx1="http://schemas.microsoft.com/office/drawing/2015/9/8/chartex" xmlns:cx2="http://schemas.microsoft.com/office/drawing/2015/10/21/chartex" xmlns:cx3="http://schemas.microsoft.com/office/drawing/2016/5/9/chartex" xmlns:cx4="http://schemas.microsoft.com/office/drawing/2016/5/10/chartex" xmlns:cx5="http://schemas.microsoft.com/office/drawing/2016/5/11/chartex" xmlns:cx6="http://schemas.microsoft.com/office/drawing/2016/5/12/chartex" xmlns:cx7="http://schemas.microsoft.com/office/drawing/2016/5/13/chartex" xmlns:cx8="http://schemas.microsoft.com/office/drawing/2016/5/14/chartex" xmlns:mc="http://schemas.openxmlformats.org/markup-compatibility/2006" xmlns:aink="http://schemas.microsoft.com/office/drawing/2016/ink" xmlns:am3d="http://schemas.microsoft.com/office/drawing/2017/model3d" xmlns:o="urn:schemas-microsoft-com:office:office" xmlns:oel="http://schemas.microsoft.com/office/2019/extlst" xmlns:r="http://schemas.openxmlformats.org/officeDocument/2006/relationships" xmlns:m="http://schemas.openxmlformats.org/officeDocument/2006/math" xmlns:v="urn:schemas-microsoft-com:vml" xmlns:wp14="http://schemas.microsoft.com/office/word/2010/wordprocessingDrawing" xmlns:wp="http://schemas.openxmlformats.org/drawingml/2006/wordprocessingDrawing" xmlns:w10="urn:schemas-microsoft-com:office:word" xmlns:w="http://schemas.openxmlformats.org/wordprocessingml/2006/main" xmlns:w14="http://schemas.microsoft.com/office/word/2010/wordml" xmlns:w15="http://schemas.microsoft.com/office/word/2012/wordml" xmlns:w16cex="http://schemas.microsoft.com/office/word/2018/wordml/cex" xmlns:w16cid="http://schemas.microsoft.com/office/word/2016/wordml/cid" xmlns:w16="http://schemas.microsoft.com/office/word/2018/wordml" xmlns:w16du="http://schemas.microsoft.com/office/word/2023/wordml/word16du" xmlns:w16sdtdh="http://schemas.microsoft.com/office/word/2020/wordml/sdtdatahash" xmlns:w16sdtfl="http://schemas.microsoft.com/office/word/2024/wordml/sdtformatlock" xmlns:w16se="http://schemas.microsoft.com/office/word/2015/wordml/symex" xmlns:wpg="http://schemas.microsoft.com/office/word/2010/wordprocessingGroup" xmlns:wpi="http://schemas.microsoft.com/office/word/2010/wordprocessingInk" xmlns:wne="http://schemas.microsoft.com/office/word/2006/wordml" xmlns:wps="http://schemas.microsoft.com/office/word/2010/wordprocessingShape" mc:Ignorable="w14 w15 w16se w16cid w16 w16cex w16sdtdh w16sdtfl w16du wp14">
   <w:p>
     <w:pPr>
       <w:pStyle w:val="Header"/>
-      <w:rPr/>
     </w:pPr>
     <w:r>
-      <w:rPr/>
       <w:tab/>
+    </w:r>
+    <w:r>
       <w:tab/>
     </w:r>
     <w:r>
-      <w:rPr/>
       <w:fldChar w:fldCharType="begin"/>
     </w:r>
     <w:r>
-      <w:rPr/>
       <w:instrText xml:space="preserve"> PAGE </w:instrText>
     </w:r>
     <w:r>
-      <w:rPr/>
       <w:fldChar w:fldCharType="separate"/>
     </w:r>
     <w:r>
-      <w:rPr/>
       <w:t>2</w:t>
     </w:r>
     <w:r>
-      <w:rPr/>
       <w:fldChar w:fldCharType="end"/>
     </w:r>
   </w:p>
@@ -603,35 +722,30 @@
 </file>
 
 <file path=word/header3.xml><?xml version="1.0" encoding="utf-8"?>
-<w:hdr xmlns:o="urn:schemas-microsoft-com:office:office" xmlns:r="http://schemas.openxmlformats.org/officeDocument/2006/relationships" xmlns:v="urn:schemas-microsoft-com:vml" xmlns:w="http://schemas.openxmlformats.org/wordprocessingml/2006/main" xmlns:w10="urn:schemas-microsoft-com:office:word" xmlns:wp="http://schemas.openxmlformats.org/drawingml/2006/wordprocessingDrawing" xmlns:pic="http://schemas.openxmlformats.org/drawingml/2006/picture" xmlns:wps="http://schemas.microsoft.com/office/word/2010/wordprocessingShape" xmlns:wpg="http://schemas.microsoft.com/office/word/2010/wordprocessingGroup" xmlns:mc="http://schemas.openxmlformats.org/markup-compatibility/2006" xmlns:wp14="http://schemas.microsoft.com/office/word/2010/wordprocessingDrawing" xmlns:w14="http://schemas.microsoft.com/office/word/2010/wordml" xmlns:w15="http://schemas.microsoft.com/office/word/2012/wordml" mc:Ignorable="w14 wp14 w15">
+<w:hdr xmlns:wpc="http://schemas.microsoft.com/office/word/2010/wordprocessingCanvas" xmlns:cx="http://schemas.microsoft.com/office/drawing/2014/chartex" xmlns:cx1="http://schemas.microsoft.com/office/drawing/2015/9/8/chartex" xmlns:cx2="http://schemas.microsoft.com/office/drawing/2015/10/21/chartex" xmlns:cx3="http://schemas.microsoft.com/office/drawing/2016/5/9/chartex" xmlns:cx4="http://schemas.microsoft.com/office/drawing/2016/5/10/chartex" xmlns:cx5="http://schemas.microsoft.com/office/drawing/2016/5/11/chartex" xmlns:cx6="http://schemas.microsoft.com/office/drawing/2016/5/12/chartex" xmlns:cx7="http://schemas.microsoft.com/office/drawing/2016/5/13/chartex" xmlns:cx8="http://schemas.microsoft.com/office/drawing/2016/5/14/chartex" xmlns:mc="http://schemas.openxmlformats.org/markup-compatibility/2006" xmlns:aink="http://schemas.microsoft.com/office/drawing/2016/ink" xmlns:am3d="http://schemas.microsoft.com/office/drawing/2017/model3d" xmlns:o="urn:schemas-microsoft-com:office:office" xmlns:oel="http://schemas.microsoft.com/office/2019/extlst" xmlns:r="http://schemas.openxmlformats.org/officeDocument/2006/relationships" xmlns:m="http://schemas.openxmlformats.org/officeDocument/2006/math" xmlns:v="urn:schemas-microsoft-com:vml" xmlns:wp14="http://schemas.microsoft.com/office/word/2010/wordprocessingDrawing" xmlns:wp="http://schemas.openxmlformats.org/drawingml/2006/wordprocessingDrawing" xmlns:w10="urn:schemas-microsoft-com:office:word" xmlns:w="http://schemas.openxmlformats.org/wordprocessingml/2006/main" xmlns:w14="http://schemas.microsoft.com/office/word/2010/wordml" xmlns:w15="http://schemas.microsoft.com/office/word/2012/wordml" xmlns:w16cex="http://schemas.microsoft.com/office/word/2018/wordml/cex" xmlns:w16cid="http://schemas.microsoft.com/office/word/2016/wordml/cid" xmlns:w16="http://schemas.microsoft.com/office/word/2018/wordml" xmlns:w16du="http://schemas.microsoft.com/office/word/2023/wordml/word16du" xmlns:w16sdtdh="http://schemas.microsoft.com/office/word/2020/wordml/sdtdatahash" xmlns:w16sdtfl="http://schemas.microsoft.com/office/word/2024/wordml/sdtformatlock" xmlns:w16se="http://schemas.microsoft.com/office/word/2015/wordml/symex" xmlns:wpg="http://schemas.microsoft.com/office/word/2010/wordprocessingGroup" xmlns:wpi="http://schemas.microsoft.com/office/word/2010/wordprocessingInk" xmlns:wne="http://schemas.microsoft.com/office/word/2006/wordml" xmlns:wps="http://schemas.microsoft.com/office/word/2010/wordprocessingShape" mc:Ignorable="w14 w15 w16se w16cid w16 w16cex w16sdtdh w16sdtfl w16du wp14">
   <w:p>
     <w:pPr>
       <w:pStyle w:val="Header"/>
-      <w:rPr/>
     </w:pPr>
     <w:r>
-      <w:rPr/>
       <w:tab/>
+    </w:r>
+    <w:r>
       <w:tab/>
     </w:r>
     <w:r>
-      <w:rPr/>
       <w:fldChar w:fldCharType="begin"/>
     </w:r>
     <w:r>
-      <w:rPr/>
       <w:instrText xml:space="preserve"> PAGE </w:instrText>
     </w:r>
     <w:r>
-      <w:rPr/>
       <w:fldChar w:fldCharType="separate"/>
     </w:r>
     <w:r>
-      <w:rPr/>
       <w:t>2</w:t>
     </w:r>
     <w:r>
-      <w:rPr/>
       <w:fldChar w:fldCharType="end"/>
     </w:r>
   </w:p>
@@ -639,8 +753,11 @@
 </file>
 
 <file path=word/numbering.xml><?xml version="1.0" encoding="utf-8"?>
-<w:numbering xmlns:w="http://schemas.openxmlformats.org/wordprocessingml/2006/main" xmlns:o="urn:schemas-microsoft-com:office:office" xmlns:r="http://schemas.openxmlformats.org/officeDocument/2006/relationships" xmlns:v="urn:schemas-microsoft-com:vml" xmlns:mc="http://schemas.openxmlformats.org/markup-compatibility/2006" xmlns:w14="http://schemas.microsoft.com/office/word/2010/wordml" mc:Ignorable="w14">
-  <w:abstractNum w:abstractNumId="1">
+<w:numbering xmlns:wpc="http://schemas.microsoft.com/office/word/2010/wordprocessingCanvas" xmlns:cx="http://schemas.microsoft.com/office/drawing/2014/chartex" xmlns:cx1="http://schemas.microsoft.com/office/drawing/2015/9/8/chartex" xmlns:cx2="http://schemas.microsoft.com/office/drawing/2015/10/21/chartex" xmlns:cx3="http://schemas.microsoft.com/office/drawing/2016/5/9/chartex" xmlns:cx4="http://schemas.microsoft.com/office/drawing/2016/5/10/chartex" xmlns:cx5="http://schemas.microsoft.com/office/drawing/2016/5/11/chartex" xmlns:cx6="http://schemas.microsoft.com/office/drawing/2016/5/12/chartex" xmlns:cx7="http://schemas.microsoft.com/office/drawing/2016/5/13/chartex" xmlns:cx8="http://schemas.microsoft.com/office/drawing/2016/5/14/chartex" xmlns:mc="http://schemas.openxmlformats.org/markup-compatibility/2006" xmlns:aink="http://schemas.microsoft.com/office/drawing/2016/ink" xmlns:am3d="http://schemas.microsoft.com/office/drawing/2017/model3d" xmlns:o="urn:schemas-microsoft-com:office:office" xmlns:oel="http://schemas.microsoft.com/office/2019/extlst" xmlns:r="http://schemas.openxmlformats.org/officeDocument/2006/relationships" xmlns:m="http://schemas.openxmlformats.org/officeDocument/2006/math" xmlns:v="urn:schemas-microsoft-com:vml" xmlns:wp14="http://schemas.microsoft.com/office/word/2010/wordprocessingDrawing" xmlns:wp="http://schemas.openxmlformats.org/drawingml/2006/wordprocessingDrawing" xmlns:w10="urn:schemas-microsoft-com:office:word" xmlns:w="http://schemas.openxmlformats.org/wordprocessingml/2006/main" xmlns:w14="http://schemas.microsoft.com/office/word/2010/wordml" xmlns:w15="http://schemas.microsoft.com/office/word/2012/wordml" xmlns:w16cex="http://schemas.microsoft.com/office/word/2018/wordml/cex" xmlns:w16cid="http://schemas.microsoft.com/office/word/2016/wordml/cid" xmlns:w16="http://schemas.microsoft.com/office/word/2018/wordml" xmlns:w16du="http://schemas.microsoft.com/office/word/2023/wordml/word16du" xmlns:w16sdtdh="http://schemas.microsoft.com/office/word/2020/wordml/sdtdatahash" xmlns:w16sdtfl="http://schemas.microsoft.com/office/word/2024/wordml/sdtformatlock" xmlns:w16se="http://schemas.microsoft.com/office/word/2015/wordml/symex" xmlns:wpg="http://schemas.microsoft.com/office/word/2010/wordprocessingGroup" xmlns:wpi="http://schemas.microsoft.com/office/word/2010/wordprocessingInk" xmlns:wne="http://schemas.microsoft.com/office/word/2006/wordml" xmlns:wps="http://schemas.microsoft.com/office/word/2010/wordprocessingShape" mc:Ignorable="w14 w15 w16se w16cid w16 w16cex w16sdtdh w16sdtfl w16du wp14">
+  <w:abstractNum w:abstractNumId="0" w15:restartNumberingAfterBreak="0">
+    <w:nsid w:val="54AB69F5"/>
+    <w:multiLevelType w:val="multilevel"/>
+    <w:tmpl w:val="398AC670"/>
     <w:lvl w:ilvl="0">
       <w:start w:val="1"/>
       <w:numFmt w:val="none"/>
@@ -651,9 +768,8 @@
         <w:tabs>
           <w:tab w:val="num" w:pos="0"/>
         </w:tabs>
-        <w:ind w:left="0" w:hanging="0"/>
-      </w:pPr>
-      <w:rPr/>
+        <w:ind w:left="0" w:firstLine="0"/>
+      </w:pPr>
     </w:lvl>
     <w:lvl w:ilvl="1">
       <w:start w:val="1"/>
@@ -665,9 +781,8 @@
         <w:tabs>
           <w:tab w:val="num" w:pos="0"/>
         </w:tabs>
-        <w:ind w:left="0" w:hanging="0"/>
-      </w:pPr>
-      <w:rPr/>
+        <w:ind w:left="0" w:firstLine="0"/>
+      </w:pPr>
     </w:lvl>
     <w:lvl w:ilvl="2">
       <w:start w:val="1"/>
@@ -679,9 +794,8 @@
         <w:tabs>
           <w:tab w:val="num" w:pos="0"/>
         </w:tabs>
-        <w:ind w:left="0" w:hanging="0"/>
-      </w:pPr>
-      <w:rPr/>
+        <w:ind w:left="0" w:firstLine="0"/>
+      </w:pPr>
     </w:lvl>
     <w:lvl w:ilvl="3">
       <w:start w:val="1"/>
@@ -693,9 +807,8 @@
         <w:tabs>
           <w:tab w:val="num" w:pos="0"/>
         </w:tabs>
-        <w:ind w:left="0" w:hanging="0"/>
-      </w:pPr>
-      <w:rPr/>
+        <w:ind w:left="0" w:firstLine="0"/>
+      </w:pPr>
     </w:lvl>
     <w:lvl w:ilvl="4">
       <w:start w:val="1"/>
@@ -707,9 +820,8 @@
         <w:tabs>
           <w:tab w:val="num" w:pos="0"/>
         </w:tabs>
-        <w:ind w:left="0" w:hanging="0"/>
-      </w:pPr>
-      <w:rPr/>
+        <w:ind w:left="0" w:firstLine="0"/>
+      </w:pPr>
     </w:lvl>
     <w:lvl w:ilvl="5">
       <w:start w:val="1"/>
@@ -721,9 +833,8 @@
         <w:tabs>
           <w:tab w:val="num" w:pos="0"/>
         </w:tabs>
-        <w:ind w:left="0" w:hanging="0"/>
-      </w:pPr>
-      <w:rPr/>
+        <w:ind w:left="0" w:firstLine="0"/>
+      </w:pPr>
     </w:lvl>
     <w:lvl w:ilvl="6">
       <w:start w:val="1"/>
@@ -735,9 +846,8 @@
         <w:tabs>
           <w:tab w:val="num" w:pos="0"/>
         </w:tabs>
-        <w:ind w:left="0" w:hanging="0"/>
-      </w:pPr>
-      <w:rPr/>
+        <w:ind w:left="0" w:firstLine="0"/>
+      </w:pPr>
     </w:lvl>
     <w:lvl w:ilvl="7">
       <w:start w:val="1"/>
@@ -749,9 +859,8 @@
         <w:tabs>
           <w:tab w:val="num" w:pos="0"/>
         </w:tabs>
-        <w:ind w:left="0" w:hanging="0"/>
-      </w:pPr>
-      <w:rPr/>
+        <w:ind w:left="0" w:firstLine="0"/>
+      </w:pPr>
     </w:lvl>
     <w:lvl w:ilvl="8">
       <w:start w:val="1"/>
@@ -763,12 +872,14 @@
         <w:tabs>
           <w:tab w:val="num" w:pos="0"/>
         </w:tabs>
-        <w:ind w:left="0" w:hanging="0"/>
-      </w:pPr>
-      <w:rPr/>
+        <w:ind w:left="0" w:firstLine="0"/>
+      </w:pPr>
     </w:lvl>
   </w:abstractNum>
-  <w:abstractNum w:abstractNumId="2">
+  <w:abstractNum w:abstractNumId="1" w15:restartNumberingAfterBreak="0">
+    <w:nsid w:val="6A550FA4"/>
+    <w:multiLevelType w:val="multilevel"/>
+    <w:tmpl w:val="5D24AE96"/>
     <w:lvl w:ilvl="0">
       <w:start w:val="1"/>
       <w:numFmt w:val="none"/>
@@ -779,7 +890,7 @@
         <w:tabs>
           <w:tab w:val="num" w:pos="0"/>
         </w:tabs>
-        <w:ind w:left="0" w:hanging="0"/>
+        <w:ind w:left="0" w:firstLine="0"/>
       </w:pPr>
     </w:lvl>
     <w:lvl w:ilvl="1">
@@ -792,7 +903,7 @@
         <w:tabs>
           <w:tab w:val="num" w:pos="0"/>
         </w:tabs>
-        <w:ind w:left="0" w:hanging="0"/>
+        <w:ind w:left="0" w:firstLine="0"/>
       </w:pPr>
     </w:lvl>
     <w:lvl w:ilvl="2">
@@ -805,7 +916,7 @@
         <w:tabs>
           <w:tab w:val="num" w:pos="0"/>
         </w:tabs>
-        <w:ind w:left="0" w:hanging="0"/>
+        <w:ind w:left="0" w:firstLine="0"/>
       </w:pPr>
     </w:lvl>
     <w:lvl w:ilvl="3">
@@ -818,7 +929,7 @@
         <w:tabs>
           <w:tab w:val="num" w:pos="0"/>
         </w:tabs>
-        <w:ind w:left="0" w:hanging="0"/>
+        <w:ind w:left="0" w:firstLine="0"/>
       </w:pPr>
     </w:lvl>
     <w:lvl w:ilvl="4">
@@ -831,7 +942,7 @@
         <w:tabs>
           <w:tab w:val="num" w:pos="0"/>
         </w:tabs>
-        <w:ind w:left="0" w:hanging="0"/>
+        <w:ind w:left="0" w:firstLine="0"/>
       </w:pPr>
     </w:lvl>
     <w:lvl w:ilvl="5">
@@ -844,7 +955,7 @@
         <w:tabs>
           <w:tab w:val="num" w:pos="0"/>
         </w:tabs>
-        <w:ind w:left="0" w:hanging="0"/>
+        <w:ind w:left="0" w:firstLine="0"/>
       </w:pPr>
     </w:lvl>
     <w:lvl w:ilvl="6">
@@ -857,7 +968,7 @@
         <w:tabs>
           <w:tab w:val="num" w:pos="0"/>
         </w:tabs>
-        <w:ind w:left="0" w:hanging="0"/>
+        <w:ind w:left="0" w:firstLine="0"/>
       </w:pPr>
     </w:lvl>
     <w:lvl w:ilvl="7">
@@ -870,7 +981,7 @@
         <w:tabs>
           <w:tab w:val="num" w:pos="0"/>
         </w:tabs>
-        <w:ind w:left="0" w:hanging="0"/>
+        <w:ind w:left="0" w:firstLine="0"/>
       </w:pPr>
     </w:lvl>
     <w:lvl w:ilvl="8">
@@ -883,25 +994,25 @@
         <w:tabs>
           <w:tab w:val="num" w:pos="0"/>
         </w:tabs>
-        <w:ind w:left="0" w:hanging="0"/>
+        <w:ind w:left="0" w:firstLine="0"/>
       </w:pPr>
     </w:lvl>
   </w:abstractNum>
-  <w:num w:numId="1">
+  <w:num w:numId="1" w16cid:durableId="460072188">
     <w:abstractNumId w:val="1"/>
   </w:num>
-  <w:num w:numId="2">
-    <w:abstractNumId w:val="2"/>
+  <w:num w:numId="2" w16cid:durableId="603224716">
+    <w:abstractNumId w:val="0"/>
   </w:num>
 </w:numbering>
 </file>
 
 <file path=word/styles.xml><?xml version="1.0" encoding="utf-8"?>
-<w:styles xmlns:w="http://schemas.openxmlformats.org/wordprocessingml/2006/main" xmlns:w14="http://schemas.microsoft.com/office/word/2010/wordml" xmlns:mc="http://schemas.openxmlformats.org/markup-compatibility/2006" mc:Ignorable="w14">
+<w:styles xmlns:mc="http://schemas.openxmlformats.org/markup-compatibility/2006" xmlns:r="http://schemas.openxmlformats.org/officeDocument/2006/relationships" xmlns:w="http://schemas.openxmlformats.org/wordprocessingml/2006/main" xmlns:w14="http://schemas.microsoft.com/office/word/2010/wordml" xmlns:w15="http://schemas.microsoft.com/office/word/2012/wordml" xmlns:w16cex="http://schemas.microsoft.com/office/word/2018/wordml/cex" xmlns:w16cid="http://schemas.microsoft.com/office/word/2016/wordml/cid" xmlns:w16="http://schemas.microsoft.com/office/word/2018/wordml" xmlns:w16du="http://schemas.microsoft.com/office/word/2023/wordml/word16du" xmlns:w16sdtdh="http://schemas.microsoft.com/office/word/2020/wordml/sdtdatahash" xmlns:w16sdtfl="http://schemas.microsoft.com/office/word/2024/wordml/sdtformatlock" xmlns:w16se="http://schemas.microsoft.com/office/word/2015/wordml/symex" mc:Ignorable="w14 w15 w16se w16cid w16 w16cex w16sdtdh w16sdtfl w16du">
   <w:docDefaults>
     <w:rPrDefault>
       <w:rPr>
-        <w:rFonts w:ascii="Liberation Serif" w:hAnsi="Liberation Serif" w:eastAsia="Droid Sans Fallback" w:cs="Droid Sans Devanagari"/>
+        <w:rFonts w:ascii="Liberation Serif" w:eastAsia="Droid Sans Fallback" w:hAnsi="Liberation Serif" w:cs="Droid Sans Devanagari"/>
         <w:kern w:val="2"/>
         <w:szCs w:val="24"/>
         <w:lang w:val="en-GB" w:eastAsia="zh-CN" w:bidi="hi-IN"/>
@@ -909,21 +1020,21 @@
     </w:rPrDefault>
     <w:pPrDefault>
       <w:pPr>
-        <w:suppressAutoHyphens w:val="true"/>
+        <w:suppressAutoHyphens/>
       </w:pPr>
     </w:pPrDefault>
   </w:docDefaults>
   <w:latentStyles w:defLockedState="0" w:defUIPriority="99" w:defSemiHidden="0" w:defUnhideWhenUsed="0" w:defQFormat="0" w:count="376">
     <w:lsdException w:name="Normal" w:uiPriority="0" w:qFormat="1"/>
     <w:lsdException w:name="heading 1" w:uiPriority="9" w:qFormat="1"/>
-    <w:lsdException w:name="heading 2" w:uiPriority="9" w:semiHidden="1" w:unhideWhenUsed="1" w:qFormat="1"/>
-    <w:lsdException w:name="heading 3" w:uiPriority="9" w:semiHidden="1" w:unhideWhenUsed="1" w:qFormat="1"/>
-    <w:lsdException w:name="heading 4" w:uiPriority="9" w:semiHidden="1" w:unhideWhenUsed="1" w:qFormat="1"/>
-    <w:lsdException w:name="heading 5" w:uiPriority="9" w:semiHidden="1" w:unhideWhenUsed="1" w:qFormat="1"/>
-    <w:lsdException w:name="heading 6" w:uiPriority="9" w:semiHidden="1" w:unhideWhenUsed="1" w:qFormat="1"/>
-    <w:lsdException w:name="heading 7" w:uiPriority="9" w:semiHidden="1" w:unhideWhenUsed="1" w:qFormat="1"/>
-    <w:lsdException w:name="heading 8" w:uiPriority="9" w:semiHidden="1" w:unhideWhenUsed="1" w:qFormat="1"/>
-    <w:lsdException w:name="heading 9" w:uiPriority="9" w:semiHidden="1" w:unhideWhenUsed="1" w:qFormat="1"/>
+    <w:lsdException w:name="heading 2" w:semiHidden="1" w:uiPriority="9" w:unhideWhenUsed="1" w:qFormat="1"/>
+    <w:lsdException w:name="heading 3" w:semiHidden="1" w:uiPriority="9" w:unhideWhenUsed="1" w:qFormat="1"/>
+    <w:lsdException w:name="heading 4" w:semiHidden="1" w:uiPriority="9" w:unhideWhenUsed="1" w:qFormat="1"/>
+    <w:lsdException w:name="heading 5" w:semiHidden="1" w:uiPriority="9" w:unhideWhenUsed="1" w:qFormat="1"/>
+    <w:lsdException w:name="heading 6" w:semiHidden="1" w:uiPriority="9" w:unhideWhenUsed="1" w:qFormat="1"/>
+    <w:lsdException w:name="heading 7" w:semiHidden="1" w:uiPriority="9" w:unhideWhenUsed="1" w:qFormat="1"/>
+    <w:lsdException w:name="heading 8" w:semiHidden="1" w:uiPriority="9" w:unhideWhenUsed="1" w:qFormat="1"/>
+    <w:lsdException w:name="heading 9" w:semiHidden="1" w:uiPriority="9" w:unhideWhenUsed="1" w:qFormat="1"/>
     <w:lsdException w:name="index 1" w:semiHidden="1" w:unhideWhenUsed="1"/>
     <w:lsdException w:name="index 2" w:semiHidden="1" w:unhideWhenUsed="1"/>
     <w:lsdException w:name="index 3" w:semiHidden="1" w:unhideWhenUsed="1"/>
@@ -933,22 +1044,22 @@
     <w:lsdException w:name="index 7" w:semiHidden="1" w:unhideWhenUsed="1"/>
     <w:lsdException w:name="index 8" w:semiHidden="1" w:unhideWhenUsed="1"/>
     <w:lsdException w:name="index 9" w:semiHidden="1" w:unhideWhenUsed="1"/>
-    <w:lsdException w:name="toc 1" w:uiPriority="39" w:semiHidden="1" w:unhideWhenUsed="1"/>
-    <w:lsdException w:name="toc 2" w:uiPriority="39" w:semiHidden="1" w:unhideWhenUsed="1"/>
-    <w:lsdException w:name="toc 3" w:uiPriority="39" w:semiHidden="1" w:unhideWhenUsed="1"/>
-    <w:lsdException w:name="toc 4" w:uiPriority="39" w:semiHidden="1" w:unhideWhenUsed="1"/>
-    <w:lsdException w:name="toc 5" w:uiPriority="39" w:semiHidden="1" w:unhideWhenUsed="1"/>
-    <w:lsdException w:name="toc 6" w:uiPriority="39" w:semiHidden="1" w:unhideWhenUsed="1"/>
-    <w:lsdException w:name="toc 7" w:uiPriority="39" w:semiHidden="1" w:unhideWhenUsed="1"/>
-    <w:lsdException w:name="toc 8" w:uiPriority="39" w:semiHidden="1" w:unhideWhenUsed="1"/>
-    <w:lsdException w:name="toc 9" w:uiPriority="39" w:semiHidden="1" w:unhideWhenUsed="1"/>
+    <w:lsdException w:name="toc 1" w:semiHidden="1" w:uiPriority="39" w:unhideWhenUsed="1"/>
+    <w:lsdException w:name="toc 2" w:semiHidden="1" w:uiPriority="39" w:unhideWhenUsed="1"/>
+    <w:lsdException w:name="toc 3" w:semiHidden="1" w:uiPriority="39" w:unhideWhenUsed="1"/>
+    <w:lsdException w:name="toc 4" w:semiHidden="1" w:uiPriority="39" w:unhideWhenUsed="1"/>
+    <w:lsdException w:name="toc 5" w:semiHidden="1" w:uiPriority="39" w:unhideWhenUsed="1"/>
+    <w:lsdException w:name="toc 6" w:semiHidden="1" w:uiPriority="39" w:unhideWhenUsed="1"/>
+    <w:lsdException w:name="toc 7" w:semiHidden="1" w:uiPriority="39" w:unhideWhenUsed="1"/>
+    <w:lsdException w:name="toc 8" w:semiHidden="1" w:uiPriority="39" w:unhideWhenUsed="1"/>
+    <w:lsdException w:name="toc 9" w:semiHidden="1" w:uiPriority="39" w:unhideWhenUsed="1"/>
     <w:lsdException w:name="Normal Indent" w:semiHidden="1" w:unhideWhenUsed="1"/>
     <w:lsdException w:name="footnote text" w:semiHidden="1" w:unhideWhenUsed="1"/>
     <w:lsdException w:name="annotation text" w:semiHidden="1" w:unhideWhenUsed="1"/>
     <w:lsdException w:name="header" w:semiHidden="1" w:unhideWhenUsed="1"/>
     <w:lsdException w:name="footer" w:semiHidden="1" w:unhideWhenUsed="1"/>
     <w:lsdException w:name="index heading" w:semiHidden="1" w:unhideWhenUsed="1"/>
-    <w:lsdException w:name="caption" w:uiPriority="35" w:semiHidden="1" w:unhideWhenUsed="1" w:qFormat="1"/>
+    <w:lsdException w:name="caption" w:semiHidden="1" w:uiPriority="35" w:unhideWhenUsed="1" w:qFormat="1"/>
     <w:lsdException w:name="table of figures" w:semiHidden="1" w:unhideWhenUsed="1"/>
     <w:lsdException w:name="envelope address" w:semiHidden="1" w:unhideWhenUsed="1"/>
     <w:lsdException w:name="envelope return" w:semiHidden="1" w:unhideWhenUsed="1"/>
@@ -979,7 +1090,7 @@
     <w:lsdException w:name="Title" w:uiPriority="10" w:qFormat="1"/>
     <w:lsdException w:name="Closing" w:semiHidden="1" w:unhideWhenUsed="1"/>
     <w:lsdException w:name="Signature" w:semiHidden="1" w:unhideWhenUsed="1"/>
-    <w:lsdException w:name="Default Paragraph Font" w:uiPriority="1" w:semiHidden="1" w:unhideWhenUsed="1"/>
+    <w:lsdException w:name="Default Paragraph Font" w:semiHidden="1" w:uiPriority="1" w:unhideWhenUsed="1"/>
     <w:lsdException w:name="Body Text" w:semiHidden="1" w:unhideWhenUsed="1"/>
     <w:lsdException w:name="Body Text Indent" w:semiHidden="1" w:unhideWhenUsed="1"/>
     <w:lsdException w:name="List Continue" w:semiHidden="1" w:unhideWhenUsed="1"/>
@@ -1179,8 +1290,8 @@
     <w:lsdException w:name="Subtle Reference" w:uiPriority="31" w:qFormat="1"/>
     <w:lsdException w:name="Intense Reference" w:uiPriority="32" w:qFormat="1"/>
     <w:lsdException w:name="Book Title" w:uiPriority="33" w:qFormat="1"/>
-    <w:lsdException w:name="Bibliography" w:uiPriority="37" w:semiHidden="1" w:unhideWhenUsed="1"/>
-    <w:lsdException w:name="TOC Heading" w:uiPriority="39" w:semiHidden="1" w:unhideWhenUsed="1" w:qFormat="1"/>
+    <w:lsdException w:name="Bibliography" w:semiHidden="1" w:uiPriority="37" w:unhideWhenUsed="1"/>
+    <w:lsdException w:name="TOC Heading" w:semiHidden="1" w:uiPriority="39" w:unhideWhenUsed="1" w:qFormat="1"/>
     <w:lsdException w:name="Plain Table 1" w:uiPriority="41"/>
     <w:lsdException w:name="Plain Table 2" w:uiPriority="42"/>
     <w:lsdException w:name="Plain Table 3" w:uiPriority="43"/>
@@ -1291,23 +1402,11 @@
     <w:lsdException w:name="Unresolved Mention" w:semiHidden="1" w:unhideWhenUsed="1"/>
     <w:lsdException w:name="Smart Link" w:semiHidden="1" w:unhideWhenUsed="1"/>
   </w:latentStyles>
-  <w:style w:type="paragraph" w:styleId="Normal" w:default="1">
+  <w:style w:type="paragraph" w:default="1" w:styleId="Normal">
     <w:name w:val="Normal"/>
     <w:qFormat/>
-    <w:pPr>
-      <w:widowControl/>
-      <w:suppressAutoHyphens w:val="true"/>
-      <w:bidi w:val="0"/>
-      <w:spacing w:before="0" w:after="0"/>
-      <w:jc w:val="left"/>
-    </w:pPr>
     <w:rPr>
-      <w:rFonts w:ascii="Liberation Serif" w:hAnsi="Liberation Serif" w:eastAsia="Droid Sans Fallback" w:cs="Droid Sans Devanagari"/>
-      <w:color w:val="auto"/>
-      <w:kern w:val="2"/>
       <w:sz w:val="24"/>
-      <w:szCs w:val="24"/>
-      <w:lang w:val="en-GB" w:eastAsia="zh-CN" w:bidi="hi-IN"/>
     </w:rPr>
   </w:style>
   <w:style w:type="paragraph" w:styleId="Heading1">
@@ -1317,13 +1416,13 @@
     <w:uiPriority w:val="9"/>
     <w:qFormat/>
     <w:pPr>
-      <w:keepNext w:val="true"/>
-      <w:widowControl w:val="false"/>
+      <w:keepNext/>
+      <w:widowControl w:val="0"/>
       <w:spacing w:before="240" w:after="120"/>
       <w:outlineLvl w:val="0"/>
     </w:pPr>
     <w:rPr>
-      <w:rFonts w:ascii="Liberation Sans" w:hAnsi="Liberation Sans" w:eastAsia="Liberation Sans" w:cs="Liberation Sans"/>
+      <w:rFonts w:ascii="Liberation Sans" w:eastAsia="Liberation Sans" w:hAnsi="Liberation Sans" w:cs="Liberation Sans"/>
       <w:b/>
       <w:kern w:val="0"/>
       <w:sz w:val="36"/>
@@ -1338,13 +1437,13 @@
     <w:unhideWhenUsed/>
     <w:qFormat/>
     <w:pPr>
-      <w:keepNext w:val="true"/>
-      <w:widowControl w:val="false"/>
+      <w:keepNext/>
+      <w:widowControl w:val="0"/>
       <w:spacing w:before="200" w:after="120"/>
       <w:outlineLvl w:val="1"/>
     </w:pPr>
     <w:rPr>
-      <w:rFonts w:ascii="Liberation Sans" w:hAnsi="Liberation Sans" w:eastAsia="Liberation Sans" w:cs="Liberation Sans"/>
+      <w:rFonts w:ascii="Liberation Sans" w:eastAsia="Liberation Sans" w:hAnsi="Liberation Sans" w:cs="Liberation Sans"/>
       <w:b/>
       <w:kern w:val="0"/>
       <w:sz w:val="32"/>
@@ -1360,32 +1459,51 @@
     <w:unhideWhenUsed/>
     <w:qFormat/>
     <w:pPr>
-      <w:keepNext w:val="true"/>
-      <w:widowControl w:val="false"/>
+      <w:keepNext/>
+      <w:widowControl w:val="0"/>
       <w:spacing w:before="140" w:after="120"/>
       <w:outlineLvl w:val="2"/>
     </w:pPr>
     <w:rPr>
-      <w:rFonts w:ascii="Liberation Sans" w:hAnsi="Liberation Sans" w:eastAsia="Liberation Sans" w:cs="Liberation Sans"/>
+      <w:rFonts w:ascii="Liberation Sans" w:eastAsia="Liberation Sans" w:hAnsi="Liberation Sans" w:cs="Liberation Sans"/>
       <w:b/>
       <w:kern w:val="0"/>
       <w:sz w:val="28"/>
       <w:szCs w:val="28"/>
     </w:rPr>
   </w:style>
-  <w:style w:type="character" w:styleId="DefaultParagraphFont" w:default="1">
+  <w:style w:type="character" w:default="1" w:styleId="DefaultParagraphFont">
     <w:name w:val="Default Paragraph Font"/>
     <w:uiPriority w:val="1"/>
     <w:semiHidden/>
     <w:unhideWhenUsed/>
-    <w:qFormat/>
-    <w:rPr/>
-  </w:style>
-  <w:style w:type="character" w:styleId="Bullets" w:customStyle="1">
+  </w:style>
+  <w:style w:type="table" w:default="1" w:styleId="TableNormal">
+    <w:name w:val="Normal Table"/>
+    <w:uiPriority w:val="99"/>
+    <w:semiHidden/>
+    <w:unhideWhenUsed/>
+    <w:tblPr>
+      <w:tblInd w:w="0" w:type="dxa"/>
+      <w:tblCellMar>
+        <w:top w:w="0" w:type="dxa"/>
+        <w:left w:w="108" w:type="dxa"/>
+        <w:bottom w:w="0" w:type="dxa"/>
+        <w:right w:w="108" w:type="dxa"/>
+      </w:tblCellMar>
+    </w:tblPr>
+  </w:style>
+  <w:style w:type="numbering" w:default="1" w:styleId="NoList">
+    <w:name w:val="No List"/>
+    <w:uiPriority w:val="99"/>
+    <w:semiHidden/>
+    <w:unhideWhenUsed/>
+  </w:style>
+  <w:style w:type="character" w:customStyle="1" w:styleId="Bullets">
     <w:name w:val="Bullets"/>
     <w:qFormat/>
     <w:rPr>
-      <w:rFonts w:ascii="OpenSymbol" w:hAnsi="OpenSymbol" w:eastAsia="OpenSymbol" w:cs="OpenSymbol"/>
+      <w:rFonts w:ascii="OpenSymbol" w:eastAsia="OpenSymbol" w:hAnsi="OpenSymbol" w:cs="OpenSymbol"/>
     </w:rPr>
   </w:style>
   <w:style w:type="character" w:styleId="CommentReference">
@@ -1395,32 +1513,32 @@
     <w:semiHidden/>
     <w:unhideWhenUsed/>
     <w:qFormat/>
-    <w:rsid w:val="003d643c"/>
+    <w:rsid w:val="003D643C"/>
     <w:rPr>
       <w:sz w:val="16"/>
       <w:szCs w:val="16"/>
     </w:rPr>
   </w:style>
-  <w:style w:type="character" w:styleId="CommentTextChar" w:customStyle="1">
+  <w:style w:type="character" w:customStyle="1" w:styleId="CommentTextChar">
     <w:name w:val="Comment Text Char"/>
     <w:basedOn w:val="DefaultParagraphFont"/>
     <w:link w:val="CommentText"/>
     <w:uiPriority w:val="99"/>
     <w:qFormat/>
-    <w:rsid w:val="003d643c"/>
+    <w:rsid w:val="003D643C"/>
     <w:rPr>
       <w:rFonts w:cs="Mangal"/>
       <w:szCs w:val="18"/>
     </w:rPr>
   </w:style>
-  <w:style w:type="character" w:styleId="CommentSubjectChar" w:customStyle="1">
+  <w:style w:type="character" w:customStyle="1" w:styleId="CommentSubjectChar">
     <w:name w:val="Comment Subject Char"/>
     <w:basedOn w:val="CommentTextChar"/>
-    <w:link w:val="annotationsubject"/>
+    <w:link w:val="CommentSubject"/>
     <w:uiPriority w:val="99"/>
     <w:semiHidden/>
     <w:qFormat/>
-    <w:rsid w:val="003d643c"/>
+    <w:rsid w:val="003D643C"/>
     <w:rPr>
       <w:rFonts w:cs="Mangal"/>
       <w:b/>
@@ -1430,20 +1548,18 @@
   </w:style>
   <w:style w:type="character" w:styleId="LineNumber">
     <w:name w:val="line number"/>
-    <w:rPr/>
-  </w:style>
-  <w:style w:type="character" w:styleId="NumberingSymbols">
+  </w:style>
+  <w:style w:type="character" w:customStyle="1" w:styleId="NumberingSymbols">
     <w:name w:val="Numbering Symbols"/>
     <w:qFormat/>
-    <w:rPr/>
-  </w:style>
-  <w:style w:type="paragraph" w:styleId="Heading" w:customStyle="1">
+  </w:style>
+  <w:style w:type="paragraph" w:customStyle="1" w:styleId="Heading">
     <w:name w:val="Heading"/>
     <w:basedOn w:val="Normal"/>
     <w:next w:val="BodyText"/>
     <w:qFormat/>
     <w:pPr>
-      <w:keepNext w:val="true"/>
+      <w:keepNext/>
       <w:spacing w:before="240" w:after="120"/>
     </w:pPr>
     <w:rPr>
@@ -1456,15 +1572,12 @@
     <w:name w:val="Body Text"/>
     <w:basedOn w:val="Normal"/>
     <w:pPr>
-      <w:spacing w:lineRule="auto" w:line="276" w:before="0" w:after="140"/>
+      <w:spacing w:after="140" w:line="276" w:lineRule="auto"/>
     </w:pPr>
-    <w:rPr/>
   </w:style>
   <w:style w:type="paragraph" w:styleId="List">
     <w:name w:val="List"/>
     <w:basedOn w:val="BodyText"/>
-    <w:pPr/>
-    <w:rPr/>
   </w:style>
   <w:style w:type="paragraph" w:styleId="Caption">
     <w:name w:val="caption"/>
@@ -1479,61 +1592,47 @@
       <w:iCs/>
     </w:rPr>
   </w:style>
-  <w:style w:type="paragraph" w:styleId="Index" w:customStyle="1">
+  <w:style w:type="paragraph" w:customStyle="1" w:styleId="Index">
     <w:name w:val="Index"/>
     <w:basedOn w:val="Normal"/>
     <w:qFormat/>
     <w:pPr>
       <w:suppressLineNumbers/>
     </w:pPr>
-    <w:rPr/>
-  </w:style>
-  <w:style w:type="paragraph" w:styleId="HeaderandFooter" w:customStyle="1">
+  </w:style>
+  <w:style w:type="paragraph" w:customStyle="1" w:styleId="HeaderandFooter">
     <w:name w:val="Header and Footer"/>
     <w:basedOn w:val="Normal"/>
     <w:qFormat/>
     <w:pPr>
       <w:suppressLineNumbers/>
       <w:tabs>
-        <w:tab w:val="clear" w:pos="709"/>
-        <w:tab w:val="center" w:pos="4819" w:leader="none"/>
-        <w:tab w:val="right" w:pos="9638" w:leader="none"/>
+        <w:tab w:val="center" w:pos="4819"/>
+        <w:tab w:val="right" w:pos="9638"/>
       </w:tabs>
     </w:pPr>
-    <w:rPr/>
   </w:style>
   <w:style w:type="paragraph" w:styleId="Header">
     <w:name w:val="header"/>
     <w:basedOn w:val="HeaderandFooter"/>
-    <w:pPr/>
-    <w:rPr/>
   </w:style>
   <w:style w:type="paragraph" w:styleId="Footer">
     <w:name w:val="footer"/>
     <w:basedOn w:val="HeaderandFooter"/>
-    <w:pPr/>
-    <w:rPr/>
   </w:style>
   <w:style w:type="paragraph" w:styleId="Revision">
     <w:name w:val="Revision"/>
     <w:uiPriority w:val="99"/>
     <w:semiHidden/>
     <w:qFormat/>
-    <w:rsid w:val="003d7226"/>
+    <w:rsid w:val="003D7226"/>
     <w:pPr>
-      <w:widowControl/>
-      <w:suppressAutoHyphens w:val="false"/>
-      <w:bidi w:val="0"/>
-      <w:spacing w:before="0" w:after="0"/>
-      <w:jc w:val="left"/>
+      <w:suppressAutoHyphens w:val="0"/>
     </w:pPr>
     <w:rPr>
-      <w:rFonts w:ascii="Liberation Serif" w:hAnsi="Liberation Serif" w:eastAsia="Droid Sans Fallback" w:cs="Mangal"/>
-      <w:color w:val="auto"/>
-      <w:kern w:val="2"/>
+      <w:rFonts w:cs="Mangal"/>
       <w:sz w:val="24"/>
       <w:szCs w:val="21"/>
-      <w:lang w:val="en-GB" w:eastAsia="zh-CN" w:bidi="hi-IN"/>
     </w:rPr>
   </w:style>
   <w:style w:type="paragraph" w:styleId="CommentText">
@@ -1543,15 +1642,14 @@
     <w:uiPriority w:val="99"/>
     <w:unhideWhenUsed/>
     <w:qFormat/>
-    <w:rsid w:val="003d643c"/>
-    <w:pPr/>
+    <w:rsid w:val="003D643C"/>
     <w:rPr>
       <w:rFonts w:cs="Mangal"/>
       <w:sz w:val="20"/>
       <w:szCs w:val="18"/>
     </w:rPr>
   </w:style>
-  <w:style w:type="paragraph" w:styleId="annotationsubject">
+  <w:style w:type="paragraph" w:styleId="CommentSubject">
     <w:name w:val="annotation subject"/>
     <w:basedOn w:val="CommentText"/>
     <w:next w:val="CommentText"/>
@@ -1560,8 +1658,7 @@
     <w:semiHidden/>
     <w:unhideWhenUsed/>
     <w:qFormat/>
-    <w:rsid w:val="003d643c"/>
-    <w:pPr/>
+    <w:rsid w:val="003D643C"/>
     <w:rPr>
       <w:b/>
       <w:bCs/>
@@ -1588,7 +1685,7 @@
     <w:next w:val="BodyText"/>
     <w:qFormat/>
     <w:pPr>
-      <w:spacing w:before="60" w:after="120"/>
+      <w:spacing w:before="60"/>
       <w:jc w:val="center"/>
     </w:pPr>
     <w:rPr>
@@ -1596,79 +1693,58 @@
       <w:szCs w:val="36"/>
     </w:rPr>
   </w:style>
-  <w:style w:type="numbering" w:styleId="NoList" w:default="1">
-    <w:name w:val="No List"/>
-    <w:uiPriority w:val="99"/>
-    <w:semiHidden/>
-    <w:unhideWhenUsed/>
-    <w:qFormat/>
-  </w:style>
-  <w:style w:type="table" w:default="1" w:styleId="TableNormal">
-    <w:name w:val="Normal Table"/>
-    <w:uiPriority w:val="99"/>
-    <w:semiHidden/>
-    <w:unhideWhenUsed/>
-    <w:tblPr>
-      <w:tblCellMar>
-        <w:top w:w="0" w:type="dxa"/>
-        <w:left w:w="108" w:type="dxa"/>
-        <w:bottom w:w="0" w:type="dxa"/>
-        <w:right w:w="108" w:type="dxa"/>
-      </w:tblCellMar>
-    </w:tblPr>
-  </w:style>
 </w:styles>
 </file>
 
 <file path=word/theme/theme1.xml><?xml version="1.0" encoding="utf-8"?>
-<a:theme xmlns:a="http://schemas.openxmlformats.org/drawingml/2006/main" xmlns:r="http://schemas.openxmlformats.org/officeDocument/2006/relationships" name="Office Theme">
+<a:theme xmlns:a="http://schemas.openxmlformats.org/drawingml/2006/main" name="Office Theme">
   <a:themeElements>
     <a:clrScheme name="Office">
       <a:dk1>
         <a:srgbClr val="000000"/>
       </a:dk1>
       <a:lt1>
-        <a:srgbClr val="ffffff"/>
+        <a:srgbClr val="FFFFFF"/>
       </a:lt1>
       <a:dk2>
-        <a:srgbClr val="44546a"/>
+        <a:srgbClr val="44546A"/>
       </a:dk2>
       <a:lt2>
-        <a:srgbClr val="e7e6e6"/>
+        <a:srgbClr val="E7E6E6"/>
       </a:lt2>
       <a:accent1>
-        <a:srgbClr val="4472c4"/>
+        <a:srgbClr val="4472C4"/>
       </a:accent1>
       <a:accent2>
-        <a:srgbClr val="ed7d31"/>
+        <a:srgbClr val="ED7D31"/>
       </a:accent2>
       <a:accent3>
-        <a:srgbClr val="a5a5a5"/>
+        <a:srgbClr val="A5A5A5"/>
       </a:accent3>
       <a:accent4>
-        <a:srgbClr val="ffc000"/>
+        <a:srgbClr val="FFC000"/>
       </a:accent4>
       <a:accent5>
-        <a:srgbClr val="5b9bd5"/>
+        <a:srgbClr val="5B9BD5"/>
       </a:accent5>
       <a:accent6>
-        <a:srgbClr val="70ad47"/>
+        <a:srgbClr val="70AD47"/>
       </a:accent6>
       <a:hlink>
-        <a:srgbClr val="0563c1"/>
+        <a:srgbClr val="0563C1"/>
       </a:hlink>
       <a:folHlink>
-        <a:srgbClr val="954f72"/>
+        <a:srgbClr val="954F72"/>
       </a:folHlink>
     </a:clrScheme>
     <a:fontScheme name="Office">
       <a:majorFont>
-        <a:latin typeface="Calibri Light" panose="020F0302020204030204" pitchFamily="0" charset="1"/>
+        <a:latin typeface="Calibri Light" panose="020F0302020204030204"/>
         <a:ea typeface=""/>
         <a:cs typeface=""/>
       </a:majorFont>
       <a:minorFont>
-        <a:latin typeface="Calibri" panose="020F0502020204030204" pitchFamily="0" charset="1"/>
+        <a:latin typeface="Calibri" panose="020F0502020204030204"/>
         <a:ea typeface=""/>
         <a:cs typeface=""/>
       </a:minorFont>
@@ -1700,7 +1776,7 @@
             </a:gs>
           </a:gsLst>
           <a:lin ang="5400000" scaled="0"/>
-          <a:tileRect l="0" t="0" r="0" b="0"/>
+          <a:tileRect/>
         </a:gradFill>
         <a:gradFill>
           <a:gsLst>
@@ -1724,7 +1800,7 @@
             </a:gs>
           </a:gsLst>
           <a:lin ang="5400000" scaled="0"/>
-          <a:tileRect l="0" t="0" r="0" b="0"/>
+          <a:tileRect/>
         </a:gradFill>
       </a:fillStyleLst>
       <a:lnStyleLst>
@@ -1784,10 +1860,12 @@
             </a:gs>
           </a:gsLst>
           <a:lin ang="5400000" scaled="0"/>
-          <a:tileRect l="0" t="0" r="0" b="0"/>
+          <a:tileRect/>
         </a:gradFill>
       </a:bgFillStyleLst>
     </a:fmtScheme>
   </a:themeElements>
+  <a:objectDefaults/>
+  <a:extraClrSchemeLst/>
 </a:theme>
 </file>
</xml_diff>